<commit_message>
final notes updated and also need more updats
</commit_message>
<xml_diff>
--- a/8-semester/software process improvement/final/done/notes.docx
+++ b/8-semester/software process improvement/final/done/notes.docx
@@ -5,109 +5,27 @@
     <w:p>
       <w:pPr>
         <w:spacing w:before="100" w:beforeAutospacing="1" w:after="0" w:line="240" w:lineRule="auto"/>
+        <w:jc w:val="center"/>
         <w:outlineLvl w:val="2"/>
         <w:rPr>
-          <w:rFonts w:ascii="Times New Roman" w:eastAsia="Times New Roman" w:hAnsi="Times New Roman" w:cs="Times New Roman"/>
-          <w:b/>
-          <w:bCs/>
-          <w:color w:val="1F1F1F"/>
-          <w:sz w:val="24"/>
-          <w:szCs w:val="24"/>
-          <w:lang w:bidi="ar-SA"/>
-        </w:rPr>
-      </w:pPr>
-      <w:r>
-        <w:rPr>
-          <w:rFonts w:ascii="Times New Roman" w:eastAsia="Times New Roman" w:hAnsi="Times New Roman" w:cs="Times New Roman"/>
-          <w:b/>
-          <w:bCs/>
-          <w:color w:val="1F1F1F"/>
-          <w:sz w:val="24"/>
-          <w:szCs w:val="24"/>
-          <w:lang w:bidi="ar-SA"/>
-        </w:rPr>
-        <w:t>Core Philosophy (Watts Humphrey)</w:t>
-      </w:r>
-    </w:p>
-    <w:p>
-      <w:pPr>
-        <w:spacing w:before="100" w:beforeAutospacing="1" w:after="0" w:line="240" w:lineRule="auto"/>
-        <w:rPr>
-          <w:rFonts w:ascii="Times New Roman" w:eastAsia="Times New Roman" w:hAnsi="Times New Roman" w:cs="Times New Roman"/>
-          <w:color w:val="1F1F1F"/>
-          <w:sz w:val="24"/>
-          <w:szCs w:val="24"/>
-          <w:lang w:bidi="ar-SA"/>
-        </w:rPr>
-      </w:pPr>
-      <w:r>
-        <w:rPr>
-          <w:rFonts w:ascii="Times New Roman" w:eastAsia="Times New Roman" w:hAnsi="Times New Roman" w:cs="Times New Roman"/>
-          <w:color w:val="1F1F1F"/>
-          <w:sz w:val="24"/>
-          <w:szCs w:val="24"/>
-          <w:bdr w:val="none" w:sz="0" w:space="0" w:color="auto" w:frame="1"/>
-          <w:lang w:bidi="ar-SA"/>
-        </w:rPr>
-        <w:t xml:space="preserve">Developed by </w:t>
-      </w:r>
-      <w:r>
-        <w:rPr>
-          <w:rFonts w:ascii="Times New Roman" w:eastAsia="Times New Roman" w:hAnsi="Times New Roman" w:cs="Times New Roman"/>
-          <w:b/>
-          <w:bCs/>
-          <w:color w:val="1F1F1F"/>
-          <w:sz w:val="24"/>
-          <w:szCs w:val="24"/>
-          <w:bdr w:val="none" w:sz="0" w:space="0" w:color="auto" w:frame="1"/>
-          <w:lang w:bidi="ar-SA"/>
-        </w:rPr>
-        <w:t>Watts Humphrey</w:t>
-      </w:r>
-      <w:r>
-        <w:rPr>
-          <w:rFonts w:ascii="Times New Roman" w:eastAsia="Times New Roman" w:hAnsi="Times New Roman" w:cs="Times New Roman"/>
-          <w:color w:val="1F1F1F"/>
-          <w:sz w:val="24"/>
-          <w:szCs w:val="24"/>
-          <w:bdr w:val="none" w:sz="0" w:space="0" w:color="auto" w:frame="1"/>
-          <w:lang w:bidi="ar-SA"/>
-        </w:rPr>
-        <w:t xml:space="preserve">, the core idea behind both PSP and TSP is that to improve your work, you must </w:t>
-      </w:r>
-      <w:r>
-        <w:rPr>
-          <w:rFonts w:ascii="Times New Roman" w:eastAsia="Times New Roman" w:hAnsi="Times New Roman" w:cs="Times New Roman"/>
-          <w:b/>
-          <w:bCs/>
-          <w:color w:val="1F1F1F"/>
-          <w:sz w:val="24"/>
-          <w:szCs w:val="24"/>
-          <w:bdr w:val="none" w:sz="0" w:space="0" w:color="auto" w:frame="1"/>
-          <w:lang w:bidi="ar-SA"/>
-        </w:rPr>
-        <w:t>constantly collect data</w:t>
-      </w:r>
-      <w:r>
-        <w:rPr>
-          <w:rFonts w:ascii="Times New Roman" w:eastAsia="Times New Roman" w:hAnsi="Times New Roman" w:cs="Times New Roman"/>
-          <w:color w:val="1F1F1F"/>
-          <w:sz w:val="24"/>
-          <w:szCs w:val="24"/>
-          <w:bdr w:val="none" w:sz="0" w:space="0" w:color="auto" w:frame="1"/>
-          <w:lang w:bidi="ar-SA"/>
-        </w:rPr>
-        <w:t xml:space="preserve"> about how you work. This data acts like a mirror, highlighting your strengths, identifying your weaknesses, and helping you build higher-quality software.</w:t>
-      </w:r>
-      <w:r>
-        <w:rPr>
-          <w:rFonts w:ascii="Times New Roman" w:eastAsia="Times New Roman" w:hAnsi="Times New Roman" w:cs="Times New Roman"/>
-          <w:color w:val="1F1F1F"/>
-          <w:sz w:val="24"/>
-          <w:szCs w:val="24"/>
-          <w:lang w:bidi="ar-SA"/>
-        </w:rPr>
-        <w:t xml:space="preserve"> </w:t>
+          <w:rFonts w:asciiTheme="majorBidi" w:eastAsia="Times New Roman" w:hAnsiTheme="majorBidi" w:cstheme="majorBidi"/>
+          <w:b/>
+          <w:bCs/>
+          <w:sz w:val="32"/>
+          <w:szCs w:val="32"/>
+          <w:lang w:bidi="ar-SA"/>
+        </w:rPr>
+      </w:pPr>
+      <w:r>
+        <w:rPr>
+          <w:rFonts w:asciiTheme="majorBidi" w:eastAsia="Times New Roman" w:hAnsiTheme="majorBidi" w:cstheme="majorBidi"/>
+          <w:b/>
+          <w:bCs/>
+          <w:sz w:val="32"/>
+          <w:szCs w:val="32"/>
+          <w:lang w:bidi="ar-SA"/>
+        </w:rPr>
+        <w:t>Process Models of SPI - Personal Software Process TSP</w:t>
       </w:r>
     </w:p>
     <w:p>
@@ -115,21 +33,118 @@
         <w:spacing w:before="100" w:beforeAutospacing="1" w:after="0" w:line="240" w:lineRule="auto"/>
         <w:outlineLvl w:val="2"/>
         <w:rPr>
-          <w:rFonts w:ascii="Times New Roman" w:eastAsia="Times New Roman" w:hAnsi="Times New Roman" w:cs="Times New Roman"/>
-          <w:b/>
-          <w:bCs/>
-          <w:color w:val="1F1F1F"/>
-          <w:sz w:val="24"/>
-          <w:szCs w:val="24"/>
-          <w:lang w:bidi="ar-SA"/>
-        </w:rPr>
-      </w:pPr>
-      <w:r>
-        <w:rPr>
-          <w:rFonts w:ascii="Times New Roman" w:eastAsia="Times New Roman" w:hAnsi="Times New Roman" w:cs="Times New Roman"/>
-          <w:b/>
-          <w:bCs/>
-          <w:color w:val="1F1F1F"/>
+          <w:rFonts w:asciiTheme="majorBidi" w:eastAsia="Times New Roman" w:hAnsiTheme="majorBidi" w:cstheme="majorBidi"/>
+          <w:b/>
+          <w:bCs/>
+          <w:sz w:val="24"/>
+          <w:szCs w:val="24"/>
+          <w:lang w:bidi="ar-SA"/>
+        </w:rPr>
+      </w:pPr>
+      <w:r>
+        <w:rPr>
+          <w:rFonts w:asciiTheme="majorBidi" w:eastAsia="Times New Roman" w:hAnsiTheme="majorBidi" w:cstheme="majorBidi"/>
+          <w:b/>
+          <w:bCs/>
+          <w:sz w:val="24"/>
+          <w:szCs w:val="24"/>
+          <w:lang w:bidi="ar-SA"/>
+        </w:rPr>
+        <w:t>Core Philosophy (Watts Humphrey)</w:t>
+      </w:r>
+    </w:p>
+    <w:p>
+      <w:pPr>
+        <w:spacing w:before="100" w:beforeAutospacing="1" w:after="0" w:line="240" w:lineRule="auto"/>
+        <w:rPr>
+          <w:rFonts w:asciiTheme="majorBidi" w:eastAsia="Times New Roman" w:hAnsiTheme="majorBidi" w:cstheme="majorBidi"/>
+          <w:sz w:val="24"/>
+          <w:szCs w:val="24"/>
+          <w:lang w:bidi="ar-SA"/>
+        </w:rPr>
+      </w:pPr>
+      <w:r>
+        <w:rPr>
+          <w:rFonts w:asciiTheme="majorBidi" w:eastAsia="Times New Roman" w:hAnsiTheme="majorBidi" w:cstheme="majorBidi"/>
+          <w:sz w:val="24"/>
+          <w:szCs w:val="24"/>
+          <w:bdr w:val="none" w:sz="0" w:space="0" w:color="auto" w:frame="1"/>
+          <w:lang w:bidi="ar-SA"/>
+        </w:rPr>
+        <w:t xml:space="preserve">Developed by </w:t>
+      </w:r>
+      <w:r>
+        <w:rPr>
+          <w:rFonts w:asciiTheme="majorBidi" w:eastAsia="Times New Roman" w:hAnsiTheme="majorBidi" w:cstheme="majorBidi"/>
+          <w:b/>
+          <w:bCs/>
+          <w:sz w:val="24"/>
+          <w:szCs w:val="24"/>
+          <w:bdr w:val="none" w:sz="0" w:space="0" w:color="auto" w:frame="1"/>
+          <w:lang w:bidi="ar-SA"/>
+        </w:rPr>
+        <w:t>Watts Humphrey</w:t>
+      </w:r>
+      <w:r>
+        <w:rPr>
+          <w:rFonts w:asciiTheme="majorBidi" w:eastAsia="Times New Roman" w:hAnsiTheme="majorBidi" w:cstheme="majorBidi"/>
+          <w:sz w:val="24"/>
+          <w:szCs w:val="24"/>
+          <w:bdr w:val="none" w:sz="0" w:space="0" w:color="auto" w:frame="1"/>
+          <w:lang w:bidi="ar-SA"/>
+        </w:rPr>
+        <w:t xml:space="preserve">, the core idea behind both PSP and TSP is that to improve your work, you must </w:t>
+      </w:r>
+      <w:r>
+        <w:rPr>
+          <w:rFonts w:asciiTheme="majorBidi" w:eastAsia="Times New Roman" w:hAnsiTheme="majorBidi" w:cstheme="majorBidi"/>
+          <w:b/>
+          <w:bCs/>
+          <w:sz w:val="24"/>
+          <w:szCs w:val="24"/>
+          <w:bdr w:val="none" w:sz="0" w:space="0" w:color="auto" w:frame="1"/>
+          <w:lang w:bidi="ar-SA"/>
+        </w:rPr>
+        <w:t>constantly collect data</w:t>
+      </w:r>
+      <w:r>
+        <w:rPr>
+          <w:rFonts w:asciiTheme="majorBidi" w:eastAsia="Times New Roman" w:hAnsiTheme="majorBidi" w:cstheme="majorBidi"/>
+          <w:sz w:val="24"/>
+          <w:szCs w:val="24"/>
+          <w:bdr w:val="none" w:sz="0" w:space="0" w:color="auto" w:frame="1"/>
+          <w:lang w:bidi="ar-SA"/>
+        </w:rPr>
+        <w:t xml:space="preserve"> about how you work. This data acts like a mirror, highlighting your strengths, identifying your weaknesses, and helping you build higher-quality software.</w:t>
+      </w:r>
+      <w:r>
+        <w:rPr>
+          <w:rFonts w:asciiTheme="majorBidi" w:eastAsia="Times New Roman" w:hAnsiTheme="majorBidi" w:cstheme="majorBidi"/>
+          <w:sz w:val="24"/>
+          <w:szCs w:val="24"/>
+          <w:lang w:bidi="ar-SA"/>
+        </w:rPr>
+        <w:t xml:space="preserve"> </w:t>
+      </w:r>
+    </w:p>
+    <w:p>
+      <w:pPr>
+        <w:spacing w:before="100" w:beforeAutospacing="1" w:after="0" w:line="240" w:lineRule="auto"/>
+        <w:outlineLvl w:val="2"/>
+        <w:rPr>
+          <w:rFonts w:asciiTheme="majorBidi" w:eastAsia="Times New Roman" w:hAnsiTheme="majorBidi" w:cstheme="majorBidi"/>
+          <w:b/>
+          <w:bCs/>
+          <w:sz w:val="24"/>
+          <w:szCs w:val="24"/>
+          <w:lang w:bidi="ar-SA"/>
+        </w:rPr>
+      </w:pPr>
+      <w:r>
+        <w:rPr>
+          <w:rFonts w:asciiTheme="majorBidi" w:eastAsia="Times New Roman" w:hAnsiTheme="majorBidi" w:cstheme="majorBidi"/>
+          <w:b/>
+          <w:bCs/>
           <w:sz w:val="24"/>
           <w:szCs w:val="24"/>
           <w:lang w:bidi="ar-SA"/>
@@ -141,19 +156,17 @@
       <w:pPr>
         <w:spacing w:before="100" w:beforeAutospacing="1" w:after="0" w:line="240" w:lineRule="auto"/>
         <w:rPr>
-          <w:rFonts w:ascii="Times New Roman" w:eastAsia="Times New Roman" w:hAnsi="Times New Roman" w:cs="Times New Roman"/>
-          <w:color w:val="1F1F1F"/>
-          <w:sz w:val="24"/>
-          <w:szCs w:val="24"/>
-          <w:lang w:bidi="ar-SA"/>
-        </w:rPr>
-      </w:pPr>
-      <w:r>
-        <w:rPr>
-          <w:rFonts w:ascii="Times New Roman" w:eastAsia="Times New Roman" w:hAnsi="Times New Roman" w:cs="Times New Roman"/>
-          <w:b/>
-          <w:bCs/>
-          <w:color w:val="1F1F1F"/>
+          <w:rFonts w:asciiTheme="majorBidi" w:eastAsia="Times New Roman" w:hAnsiTheme="majorBidi" w:cstheme="majorBidi"/>
+          <w:sz w:val="24"/>
+          <w:szCs w:val="24"/>
+          <w:lang w:bidi="ar-SA"/>
+        </w:rPr>
+      </w:pPr>
+      <w:r>
+        <w:rPr>
+          <w:rFonts w:asciiTheme="majorBidi" w:eastAsia="Times New Roman" w:hAnsiTheme="majorBidi" w:cstheme="majorBidi"/>
+          <w:b/>
+          <w:bCs/>
           <w:sz w:val="24"/>
           <w:szCs w:val="24"/>
           <w:bdr w:val="none" w:sz="0" w:space="0" w:color="auto" w:frame="1"/>
@@ -163,8 +176,7 @@
       </w:r>
       <w:r>
         <w:rPr>
-          <w:rFonts w:ascii="Times New Roman" w:eastAsia="Times New Roman" w:hAnsi="Times New Roman" w:cs="Times New Roman"/>
-          <w:color w:val="1F1F1F"/>
+          <w:rFonts w:asciiTheme="majorBidi" w:eastAsia="Times New Roman" w:hAnsiTheme="majorBidi" w:cstheme="majorBidi"/>
           <w:sz w:val="24"/>
           <w:szCs w:val="24"/>
           <w:bdr w:val="none" w:sz="0" w:space="0" w:color="auto" w:frame="1"/>
@@ -174,10 +186,9 @@
       </w:r>
       <w:r>
         <w:rPr>
-          <w:rFonts w:ascii="Times New Roman" w:eastAsia="Times New Roman" w:hAnsi="Times New Roman" w:cs="Times New Roman"/>
-          <w:b/>
-          <w:bCs/>
-          <w:color w:val="1F1F1F"/>
+          <w:rFonts w:asciiTheme="majorBidi" w:eastAsia="Times New Roman" w:hAnsiTheme="majorBidi" w:cstheme="majorBidi"/>
+          <w:b/>
+          <w:bCs/>
           <w:sz w:val="24"/>
           <w:szCs w:val="24"/>
           <w:bdr w:val="none" w:sz="0" w:space="0" w:color="auto" w:frame="1"/>
@@ -187,8 +198,7 @@
       </w:r>
       <w:r>
         <w:rPr>
-          <w:rFonts w:ascii="Times New Roman" w:eastAsia="Times New Roman" w:hAnsi="Times New Roman" w:cs="Times New Roman"/>
-          <w:color w:val="1F1F1F"/>
+          <w:rFonts w:asciiTheme="majorBidi" w:eastAsia="Times New Roman" w:hAnsiTheme="majorBidi" w:cstheme="majorBidi"/>
           <w:sz w:val="24"/>
           <w:szCs w:val="24"/>
           <w:bdr w:val="none" w:sz="0" w:space="0" w:color="auto" w:frame="1"/>
@@ -198,8 +208,7 @@
       </w:r>
       <w:r>
         <w:rPr>
-          <w:rFonts w:ascii="Times New Roman" w:eastAsia="Times New Roman" w:hAnsi="Times New Roman" w:cs="Times New Roman"/>
-          <w:color w:val="1F1F1F"/>
+          <w:rFonts w:asciiTheme="majorBidi" w:eastAsia="Times New Roman" w:hAnsiTheme="majorBidi" w:cstheme="majorBidi"/>
           <w:sz w:val="24"/>
           <w:szCs w:val="24"/>
           <w:lang w:bidi="ar-SA"/>
@@ -211,14 +220,16 @@
       <w:pPr>
         <w:spacing w:before="100" w:beforeAutospacing="1" w:after="0" w:line="240" w:lineRule="auto"/>
         <w:rPr>
-          <w:rFonts w:ascii="Times New Roman" w:eastAsia="Times New Roman" w:hAnsi="Times New Roman" w:cs="Times New Roman"/>
-          <w:color w:val="1F1F1F"/>
-          <w:sz w:val="24"/>
-          <w:szCs w:val="24"/>
-          <w:lang w:bidi="ar-SA"/>
-        </w:rPr>
-      </w:pPr>
-      <w:r>
+          <w:rFonts w:asciiTheme="majorBidi" w:eastAsia="Times New Roman" w:hAnsiTheme="majorBidi" w:cstheme="majorBidi"/>
+          <w:sz w:val="24"/>
+          <w:szCs w:val="24"/>
+          <w:lang w:bidi="ar-SA"/>
+        </w:rPr>
+      </w:pPr>
+      <w:r>
+        <w:rPr>
+          <w:rFonts w:asciiTheme="majorBidi" w:hAnsiTheme="majorBidi" w:cstheme="majorBidi"/>
+        </w:rPr>
         <w:t>Focuses on personal improvement in coding, testing, and time management</w:t>
       </w:r>
     </w:p>
@@ -226,21 +237,19 @@
       <w:pPr>
         <w:spacing w:before="100" w:beforeAutospacing="1" w:after="0" w:line="240" w:lineRule="auto"/>
         <w:rPr>
-          <w:rFonts w:ascii="Times New Roman" w:eastAsia="Times New Roman" w:hAnsi="Times New Roman" w:cs="Times New Roman"/>
-          <w:b/>
-          <w:bCs/>
-          <w:color w:val="1F1F1F"/>
-          <w:sz w:val="24"/>
-          <w:szCs w:val="24"/>
-          <w:lang w:bidi="ar-SA"/>
-        </w:rPr>
-      </w:pPr>
-      <w:r>
-        <w:rPr>
-          <w:rFonts w:ascii="Times New Roman" w:eastAsia="Times New Roman" w:hAnsi="Times New Roman" w:cs="Times New Roman"/>
-          <w:b/>
-          <w:bCs/>
-          <w:color w:val="1F1F1F"/>
+          <w:rFonts w:asciiTheme="majorBidi" w:eastAsia="Times New Roman" w:hAnsiTheme="majorBidi" w:cstheme="majorBidi"/>
+          <w:b/>
+          <w:bCs/>
+          <w:sz w:val="24"/>
+          <w:szCs w:val="24"/>
+          <w:lang w:bidi="ar-SA"/>
+        </w:rPr>
+      </w:pPr>
+      <w:r>
+        <w:rPr>
+          <w:rFonts w:asciiTheme="majorBidi" w:eastAsia="Times New Roman" w:hAnsiTheme="majorBidi" w:cstheme="majorBidi"/>
+          <w:b/>
+          <w:bCs/>
           <w:sz w:val="24"/>
           <w:szCs w:val="24"/>
           <w:bdr w:val="none" w:sz="0" w:space="0" w:color="auto" w:frame="1"/>
@@ -257,19 +266,17 @@
         </w:numPr>
         <w:spacing w:before="100" w:beforeAutospacing="1" w:after="0" w:line="240" w:lineRule="auto"/>
         <w:rPr>
-          <w:rFonts w:ascii="Times New Roman" w:eastAsia="Times New Roman" w:hAnsi="Times New Roman" w:cs="Times New Roman"/>
-          <w:color w:val="1F1F1F"/>
-          <w:sz w:val="24"/>
-          <w:szCs w:val="24"/>
-          <w:lang w:bidi="ar-SA"/>
-        </w:rPr>
-      </w:pPr>
-      <w:r>
-        <w:rPr>
-          <w:rFonts w:ascii="Times New Roman" w:eastAsia="Times New Roman" w:hAnsi="Times New Roman" w:cs="Times New Roman"/>
-          <w:b/>
-          <w:bCs/>
-          <w:color w:val="1F1F1F"/>
+          <w:rFonts w:asciiTheme="majorBidi" w:eastAsia="Times New Roman" w:hAnsiTheme="majorBidi" w:cstheme="majorBidi"/>
+          <w:sz w:val="24"/>
+          <w:szCs w:val="24"/>
+          <w:lang w:bidi="ar-SA"/>
+        </w:rPr>
+      </w:pPr>
+      <w:r>
+        <w:rPr>
+          <w:rFonts w:asciiTheme="majorBidi" w:eastAsia="Times New Roman" w:hAnsiTheme="majorBidi" w:cstheme="majorBidi"/>
+          <w:b/>
+          <w:bCs/>
           <w:sz w:val="24"/>
           <w:szCs w:val="24"/>
           <w:bdr w:val="none" w:sz="0" w:space="0" w:color="auto" w:frame="1"/>
@@ -279,8 +286,7 @@
       </w:r>
       <w:r>
         <w:rPr>
-          <w:rFonts w:ascii="Times New Roman" w:eastAsia="Times New Roman" w:hAnsi="Times New Roman" w:cs="Times New Roman"/>
-          <w:color w:val="1F1F1F"/>
+          <w:rFonts w:asciiTheme="majorBidi" w:eastAsia="Times New Roman" w:hAnsiTheme="majorBidi" w:cstheme="majorBidi"/>
           <w:sz w:val="24"/>
           <w:szCs w:val="24"/>
           <w:bdr w:val="none" w:sz="0" w:space="0" w:color="auto" w:frame="1"/>
@@ -290,8 +296,7 @@
       </w:r>
       <w:r>
         <w:rPr>
-          <w:rFonts w:ascii="Times New Roman" w:eastAsia="Times New Roman" w:hAnsi="Times New Roman" w:cs="Times New Roman"/>
-          <w:color w:val="1F1F1F"/>
+          <w:rFonts w:asciiTheme="majorBidi" w:eastAsia="Times New Roman" w:hAnsiTheme="majorBidi" w:cstheme="majorBidi"/>
           <w:sz w:val="24"/>
           <w:szCs w:val="24"/>
           <w:lang w:bidi="ar-SA"/>
@@ -307,19 +312,17 @@
         </w:numPr>
         <w:spacing w:before="100" w:beforeAutospacing="1" w:after="0" w:line="240" w:lineRule="auto"/>
         <w:rPr>
-          <w:rFonts w:ascii="Times New Roman" w:eastAsia="Times New Roman" w:hAnsi="Times New Roman" w:cs="Times New Roman"/>
-          <w:color w:val="1F1F1F"/>
-          <w:sz w:val="24"/>
-          <w:szCs w:val="24"/>
-          <w:lang w:bidi="ar-SA"/>
-        </w:rPr>
-      </w:pPr>
-      <w:r>
-        <w:rPr>
-          <w:rFonts w:ascii="Times New Roman" w:eastAsia="Times New Roman" w:hAnsi="Times New Roman" w:cs="Times New Roman"/>
-          <w:b/>
-          <w:bCs/>
-          <w:color w:val="1F1F1F"/>
+          <w:rFonts w:asciiTheme="majorBidi" w:eastAsia="Times New Roman" w:hAnsiTheme="majorBidi" w:cstheme="majorBidi"/>
+          <w:sz w:val="24"/>
+          <w:szCs w:val="24"/>
+          <w:lang w:bidi="ar-SA"/>
+        </w:rPr>
+      </w:pPr>
+      <w:r>
+        <w:rPr>
+          <w:rFonts w:asciiTheme="majorBidi" w:eastAsia="Times New Roman" w:hAnsiTheme="majorBidi" w:cstheme="majorBidi"/>
+          <w:b/>
+          <w:bCs/>
           <w:sz w:val="24"/>
           <w:szCs w:val="24"/>
           <w:bdr w:val="none" w:sz="0" w:space="0" w:color="auto" w:frame="1"/>
@@ -329,8 +332,7 @@
       </w:r>
       <w:r>
         <w:rPr>
-          <w:rFonts w:ascii="Times New Roman" w:eastAsia="Times New Roman" w:hAnsi="Times New Roman" w:cs="Times New Roman"/>
-          <w:color w:val="1F1F1F"/>
+          <w:rFonts w:asciiTheme="majorBidi" w:eastAsia="Times New Roman" w:hAnsiTheme="majorBidi" w:cstheme="majorBidi"/>
           <w:sz w:val="24"/>
           <w:szCs w:val="24"/>
           <w:bdr w:val="none" w:sz="0" w:space="0" w:color="auto" w:frame="1"/>
@@ -340,8 +342,7 @@
       </w:r>
       <w:r>
         <w:rPr>
-          <w:rFonts w:ascii="Times New Roman" w:eastAsia="Times New Roman" w:hAnsi="Times New Roman" w:cs="Times New Roman"/>
-          <w:color w:val="1F1F1F"/>
+          <w:rFonts w:asciiTheme="majorBidi" w:eastAsia="Times New Roman" w:hAnsiTheme="majorBidi" w:cstheme="majorBidi"/>
           <w:sz w:val="24"/>
           <w:szCs w:val="24"/>
           <w:lang w:bidi="ar-SA"/>
@@ -357,19 +358,17 @@
         </w:numPr>
         <w:spacing w:before="100" w:beforeAutospacing="1" w:after="0" w:line="240" w:lineRule="auto"/>
         <w:rPr>
-          <w:rFonts w:ascii="Times New Roman" w:eastAsia="Times New Roman" w:hAnsi="Times New Roman" w:cs="Times New Roman"/>
-          <w:color w:val="1F1F1F"/>
-          <w:sz w:val="24"/>
-          <w:szCs w:val="24"/>
-          <w:lang w:bidi="ar-SA"/>
-        </w:rPr>
-      </w:pPr>
-      <w:r>
-        <w:rPr>
-          <w:rFonts w:ascii="Times New Roman" w:eastAsia="Times New Roman" w:hAnsi="Times New Roman" w:cs="Times New Roman"/>
-          <w:b/>
-          <w:bCs/>
-          <w:color w:val="1F1F1F"/>
+          <w:rFonts w:asciiTheme="majorBidi" w:eastAsia="Times New Roman" w:hAnsiTheme="majorBidi" w:cstheme="majorBidi"/>
+          <w:sz w:val="24"/>
+          <w:szCs w:val="24"/>
+          <w:lang w:bidi="ar-SA"/>
+        </w:rPr>
+      </w:pPr>
+      <w:r>
+        <w:rPr>
+          <w:rFonts w:asciiTheme="majorBidi" w:eastAsia="Times New Roman" w:hAnsiTheme="majorBidi" w:cstheme="majorBidi"/>
+          <w:b/>
+          <w:bCs/>
           <w:sz w:val="24"/>
           <w:szCs w:val="24"/>
           <w:bdr w:val="none" w:sz="0" w:space="0" w:color="auto" w:frame="1"/>
@@ -379,8 +378,7 @@
       </w:r>
       <w:r>
         <w:rPr>
-          <w:rFonts w:ascii="Times New Roman" w:eastAsia="Times New Roman" w:hAnsi="Times New Roman" w:cs="Times New Roman"/>
-          <w:color w:val="1F1F1F"/>
+          <w:rFonts w:asciiTheme="majorBidi" w:eastAsia="Times New Roman" w:hAnsiTheme="majorBidi" w:cstheme="majorBidi"/>
           <w:sz w:val="24"/>
           <w:szCs w:val="24"/>
           <w:bdr w:val="none" w:sz="0" w:space="0" w:color="auto" w:frame="1"/>
@@ -390,8 +388,7 @@
       </w:r>
       <w:r>
         <w:rPr>
-          <w:rFonts w:ascii="Times New Roman" w:eastAsia="Times New Roman" w:hAnsi="Times New Roman" w:cs="Times New Roman"/>
-          <w:color w:val="1F1F1F"/>
+          <w:rFonts w:asciiTheme="majorBidi" w:eastAsia="Times New Roman" w:hAnsiTheme="majorBidi" w:cstheme="majorBidi"/>
           <w:sz w:val="24"/>
           <w:szCs w:val="24"/>
           <w:lang w:bidi="ar-SA"/>
@@ -403,21 +400,19 @@
       <w:pPr>
         <w:spacing w:before="100" w:beforeAutospacing="1" w:after="0" w:line="240" w:lineRule="auto"/>
         <w:rPr>
-          <w:rFonts w:ascii="Times New Roman" w:eastAsia="Times New Roman" w:hAnsi="Times New Roman" w:cs="Times New Roman"/>
-          <w:b/>
-          <w:bCs/>
-          <w:color w:val="1F1F1F"/>
-          <w:sz w:val="24"/>
-          <w:szCs w:val="24"/>
-          <w:lang w:bidi="ar-SA"/>
-        </w:rPr>
-      </w:pPr>
-      <w:r>
-        <w:rPr>
-          <w:rFonts w:ascii="Times New Roman" w:eastAsia="Times New Roman" w:hAnsi="Times New Roman" w:cs="Times New Roman"/>
-          <w:b/>
-          <w:bCs/>
-          <w:color w:val="1F1F1F"/>
+          <w:rFonts w:asciiTheme="majorBidi" w:eastAsia="Times New Roman" w:hAnsiTheme="majorBidi" w:cstheme="majorBidi"/>
+          <w:b/>
+          <w:bCs/>
+          <w:sz w:val="24"/>
+          <w:szCs w:val="24"/>
+          <w:lang w:bidi="ar-SA"/>
+        </w:rPr>
+      </w:pPr>
+      <w:r>
+        <w:rPr>
+          <w:rFonts w:asciiTheme="majorBidi" w:eastAsia="Times New Roman" w:hAnsiTheme="majorBidi" w:cstheme="majorBidi"/>
+          <w:b/>
+          <w:bCs/>
           <w:sz w:val="24"/>
           <w:szCs w:val="24"/>
           <w:bdr w:val="none" w:sz="0" w:space="0" w:color="auto" w:frame="1"/>
@@ -434,19 +429,17 @@
         </w:numPr>
         <w:spacing w:before="100" w:beforeAutospacing="1" w:after="0" w:line="240" w:lineRule="auto"/>
         <w:rPr>
-          <w:rFonts w:ascii="Times New Roman" w:eastAsia="Times New Roman" w:hAnsi="Times New Roman" w:cs="Times New Roman"/>
-          <w:color w:val="1F1F1F"/>
-          <w:sz w:val="24"/>
-          <w:szCs w:val="24"/>
-          <w:lang w:bidi="ar-SA"/>
-        </w:rPr>
-      </w:pPr>
-      <w:r>
-        <w:rPr>
-          <w:rFonts w:ascii="Times New Roman" w:eastAsia="Times New Roman" w:hAnsi="Times New Roman" w:cs="Times New Roman"/>
-          <w:b/>
-          <w:bCs/>
-          <w:color w:val="1F1F1F"/>
+          <w:rFonts w:asciiTheme="majorBidi" w:eastAsia="Times New Roman" w:hAnsiTheme="majorBidi" w:cstheme="majorBidi"/>
+          <w:sz w:val="24"/>
+          <w:szCs w:val="24"/>
+          <w:lang w:bidi="ar-SA"/>
+        </w:rPr>
+      </w:pPr>
+      <w:r>
+        <w:rPr>
+          <w:rFonts w:asciiTheme="majorBidi" w:eastAsia="Times New Roman" w:hAnsiTheme="majorBidi" w:cstheme="majorBidi"/>
+          <w:b/>
+          <w:bCs/>
           <w:sz w:val="24"/>
           <w:szCs w:val="24"/>
           <w:bdr w:val="none" w:sz="0" w:space="0" w:color="auto" w:frame="1"/>
@@ -456,8 +449,7 @@
       </w:r>
       <w:r>
         <w:rPr>
-          <w:rFonts w:ascii="Times New Roman" w:eastAsia="Times New Roman" w:hAnsi="Times New Roman" w:cs="Times New Roman"/>
-          <w:color w:val="1F1F1F"/>
+          <w:rFonts w:asciiTheme="majorBidi" w:eastAsia="Times New Roman" w:hAnsiTheme="majorBidi" w:cstheme="majorBidi"/>
           <w:sz w:val="24"/>
           <w:szCs w:val="24"/>
           <w:bdr w:val="none" w:sz="0" w:space="0" w:color="auto" w:frame="1"/>
@@ -467,8 +459,7 @@
       </w:r>
       <w:r>
         <w:rPr>
-          <w:rFonts w:ascii="Times New Roman" w:eastAsia="Times New Roman" w:hAnsi="Times New Roman" w:cs="Times New Roman"/>
-          <w:color w:val="1F1F1F"/>
+          <w:rFonts w:asciiTheme="majorBidi" w:eastAsia="Times New Roman" w:hAnsiTheme="majorBidi" w:cstheme="majorBidi"/>
           <w:sz w:val="24"/>
           <w:szCs w:val="24"/>
           <w:bdr w:val="none" w:sz="0" w:space="0" w:color="auto" w:frame="1"/>
@@ -478,8 +469,7 @@
       </w:r>
       <w:r>
         <w:rPr>
-          <w:rFonts w:ascii="Times New Roman" w:eastAsia="Times New Roman" w:hAnsi="Times New Roman" w:cs="Times New Roman"/>
-          <w:color w:val="1F1F1F"/>
+          <w:rFonts w:asciiTheme="majorBidi" w:eastAsia="Times New Roman" w:hAnsiTheme="majorBidi" w:cstheme="majorBidi"/>
           <w:sz w:val="24"/>
           <w:szCs w:val="24"/>
           <w:bdr w:val="none" w:sz="0" w:space="0" w:color="auto" w:frame="1"/>
@@ -489,8 +479,7 @@
       </w:r>
       <w:r>
         <w:rPr>
-          <w:rFonts w:ascii="Times New Roman" w:eastAsia="Times New Roman" w:hAnsi="Times New Roman" w:cs="Times New Roman"/>
-          <w:color w:val="1F1F1F"/>
+          <w:rFonts w:asciiTheme="majorBidi" w:eastAsia="Times New Roman" w:hAnsiTheme="majorBidi" w:cstheme="majorBidi"/>
           <w:sz w:val="24"/>
           <w:szCs w:val="24"/>
           <w:lang w:bidi="ar-SA"/>
@@ -506,19 +495,17 @@
         </w:numPr>
         <w:spacing w:before="100" w:beforeAutospacing="1" w:after="0" w:line="240" w:lineRule="auto"/>
         <w:rPr>
-          <w:rFonts w:ascii="Times New Roman" w:eastAsia="Times New Roman" w:hAnsi="Times New Roman" w:cs="Times New Roman"/>
-          <w:color w:val="1F1F1F"/>
-          <w:sz w:val="24"/>
-          <w:szCs w:val="24"/>
-          <w:lang w:bidi="ar-SA"/>
-        </w:rPr>
-      </w:pPr>
-      <w:r>
-        <w:rPr>
-          <w:rFonts w:ascii="Times New Roman" w:eastAsia="Times New Roman" w:hAnsi="Times New Roman" w:cs="Times New Roman"/>
-          <w:b/>
-          <w:bCs/>
-          <w:color w:val="1F1F1F"/>
+          <w:rFonts w:asciiTheme="majorBidi" w:eastAsia="Times New Roman" w:hAnsiTheme="majorBidi" w:cstheme="majorBidi"/>
+          <w:sz w:val="24"/>
+          <w:szCs w:val="24"/>
+          <w:lang w:bidi="ar-SA"/>
+        </w:rPr>
+      </w:pPr>
+      <w:r>
+        <w:rPr>
+          <w:rFonts w:asciiTheme="majorBidi" w:eastAsia="Times New Roman" w:hAnsiTheme="majorBidi" w:cstheme="majorBidi"/>
+          <w:b/>
+          <w:bCs/>
           <w:sz w:val="24"/>
           <w:szCs w:val="24"/>
           <w:bdr w:val="none" w:sz="0" w:space="0" w:color="auto" w:frame="1"/>
@@ -528,8 +515,7 @@
       </w:r>
       <w:r>
         <w:rPr>
-          <w:rFonts w:ascii="Times New Roman" w:eastAsia="Times New Roman" w:hAnsi="Times New Roman" w:cs="Times New Roman"/>
-          <w:color w:val="1F1F1F"/>
+          <w:rFonts w:asciiTheme="majorBidi" w:eastAsia="Times New Roman" w:hAnsiTheme="majorBidi" w:cstheme="majorBidi"/>
           <w:sz w:val="24"/>
           <w:szCs w:val="24"/>
           <w:bdr w:val="none" w:sz="0" w:space="0" w:color="auto" w:frame="1"/>
@@ -539,8 +525,7 @@
       </w:r>
       <w:r>
         <w:rPr>
-          <w:rFonts w:ascii="Times New Roman" w:eastAsia="Times New Roman" w:hAnsi="Times New Roman" w:cs="Times New Roman"/>
-          <w:color w:val="1F1F1F"/>
+          <w:rFonts w:asciiTheme="majorBidi" w:eastAsia="Times New Roman" w:hAnsiTheme="majorBidi" w:cstheme="majorBidi"/>
           <w:sz w:val="24"/>
           <w:szCs w:val="24"/>
           <w:bdr w:val="none" w:sz="0" w:space="0" w:color="auto" w:frame="1"/>
@@ -550,8 +535,7 @@
       </w:r>
       <w:r>
         <w:rPr>
-          <w:rFonts w:ascii="Times New Roman" w:eastAsia="Times New Roman" w:hAnsi="Times New Roman" w:cs="Times New Roman"/>
-          <w:color w:val="1F1F1F"/>
+          <w:rFonts w:asciiTheme="majorBidi" w:eastAsia="Times New Roman" w:hAnsiTheme="majorBidi" w:cstheme="majorBidi"/>
           <w:sz w:val="24"/>
           <w:szCs w:val="24"/>
           <w:bdr w:val="none" w:sz="0" w:space="0" w:color="auto" w:frame="1"/>
@@ -561,8 +545,7 @@
       </w:r>
       <w:r>
         <w:rPr>
-          <w:rFonts w:ascii="Times New Roman" w:eastAsia="Times New Roman" w:hAnsi="Times New Roman" w:cs="Times New Roman"/>
-          <w:color w:val="1F1F1F"/>
+          <w:rFonts w:asciiTheme="majorBidi" w:eastAsia="Times New Roman" w:hAnsiTheme="majorBidi" w:cstheme="majorBidi"/>
           <w:sz w:val="24"/>
           <w:szCs w:val="24"/>
           <w:lang w:bidi="ar-SA"/>
@@ -578,19 +561,17 @@
         </w:numPr>
         <w:spacing w:before="100" w:beforeAutospacing="1" w:after="0" w:line="240" w:lineRule="auto"/>
         <w:rPr>
-          <w:rFonts w:ascii="Times New Roman" w:eastAsia="Times New Roman" w:hAnsi="Times New Roman" w:cs="Times New Roman"/>
-          <w:color w:val="1F1F1F"/>
-          <w:sz w:val="24"/>
-          <w:szCs w:val="24"/>
-          <w:lang w:bidi="ar-SA"/>
-        </w:rPr>
-      </w:pPr>
-      <w:r>
-        <w:rPr>
-          <w:rFonts w:ascii="Times New Roman" w:eastAsia="Times New Roman" w:hAnsi="Times New Roman" w:cs="Times New Roman"/>
-          <w:b/>
-          <w:bCs/>
-          <w:color w:val="1F1F1F"/>
+          <w:rFonts w:asciiTheme="majorBidi" w:eastAsia="Times New Roman" w:hAnsiTheme="majorBidi" w:cstheme="majorBidi"/>
+          <w:sz w:val="24"/>
+          <w:szCs w:val="24"/>
+          <w:lang w:bidi="ar-SA"/>
+        </w:rPr>
+      </w:pPr>
+      <w:r>
+        <w:rPr>
+          <w:rFonts w:asciiTheme="majorBidi" w:eastAsia="Times New Roman" w:hAnsiTheme="majorBidi" w:cstheme="majorBidi"/>
+          <w:b/>
+          <w:bCs/>
           <w:sz w:val="24"/>
           <w:szCs w:val="24"/>
           <w:bdr w:val="none" w:sz="0" w:space="0" w:color="auto" w:frame="1"/>
@@ -600,8 +581,7 @@
       </w:r>
       <w:r>
         <w:rPr>
-          <w:rFonts w:ascii="Times New Roman" w:eastAsia="Times New Roman" w:hAnsi="Times New Roman" w:cs="Times New Roman"/>
-          <w:color w:val="1F1F1F"/>
+          <w:rFonts w:asciiTheme="majorBidi" w:eastAsia="Times New Roman" w:hAnsiTheme="majorBidi" w:cstheme="majorBidi"/>
           <w:sz w:val="24"/>
           <w:szCs w:val="24"/>
           <w:bdr w:val="none" w:sz="0" w:space="0" w:color="auto" w:frame="1"/>
@@ -611,8 +591,7 @@
       </w:r>
       <w:r>
         <w:rPr>
-          <w:rFonts w:ascii="Times New Roman" w:eastAsia="Times New Roman" w:hAnsi="Times New Roman" w:cs="Times New Roman"/>
-          <w:color w:val="1F1F1F"/>
+          <w:rFonts w:asciiTheme="majorBidi" w:eastAsia="Times New Roman" w:hAnsiTheme="majorBidi" w:cstheme="majorBidi"/>
           <w:sz w:val="24"/>
           <w:szCs w:val="24"/>
           <w:bdr w:val="none" w:sz="0" w:space="0" w:color="auto" w:frame="1"/>
@@ -622,8 +601,7 @@
       </w:r>
       <w:r>
         <w:rPr>
-          <w:rFonts w:ascii="Times New Roman" w:eastAsia="Times New Roman" w:hAnsi="Times New Roman" w:cs="Times New Roman"/>
-          <w:color w:val="1F1F1F"/>
+          <w:rFonts w:asciiTheme="majorBidi" w:eastAsia="Times New Roman" w:hAnsiTheme="majorBidi" w:cstheme="majorBidi"/>
           <w:sz w:val="24"/>
           <w:szCs w:val="24"/>
           <w:bdr w:val="none" w:sz="0" w:space="0" w:color="auto" w:frame="1"/>
@@ -633,8 +611,7 @@
       </w:r>
       <w:r>
         <w:rPr>
-          <w:rFonts w:ascii="Times New Roman" w:eastAsia="Times New Roman" w:hAnsi="Times New Roman" w:cs="Times New Roman"/>
-          <w:color w:val="1F1F1F"/>
+          <w:rFonts w:asciiTheme="majorBidi" w:eastAsia="Times New Roman" w:hAnsiTheme="majorBidi" w:cstheme="majorBidi"/>
           <w:sz w:val="24"/>
           <w:szCs w:val="24"/>
           <w:lang w:bidi="ar-SA"/>
@@ -650,19 +627,17 @@
         </w:numPr>
         <w:spacing w:before="100" w:beforeAutospacing="1" w:after="0" w:line="240" w:lineRule="auto"/>
         <w:rPr>
-          <w:rFonts w:ascii="Times New Roman" w:eastAsia="Times New Roman" w:hAnsi="Times New Roman" w:cs="Times New Roman"/>
-          <w:color w:val="1F1F1F"/>
-          <w:sz w:val="24"/>
-          <w:szCs w:val="24"/>
-          <w:lang w:bidi="ar-SA"/>
-        </w:rPr>
-      </w:pPr>
-      <w:r>
-        <w:rPr>
-          <w:rFonts w:ascii="Times New Roman" w:eastAsia="Times New Roman" w:hAnsi="Times New Roman" w:cs="Times New Roman"/>
-          <w:b/>
-          <w:bCs/>
-          <w:color w:val="1F1F1F"/>
+          <w:rFonts w:asciiTheme="majorBidi" w:eastAsia="Times New Roman" w:hAnsiTheme="majorBidi" w:cstheme="majorBidi"/>
+          <w:sz w:val="24"/>
+          <w:szCs w:val="24"/>
+          <w:lang w:bidi="ar-SA"/>
+        </w:rPr>
+      </w:pPr>
+      <w:r>
+        <w:rPr>
+          <w:rFonts w:asciiTheme="majorBidi" w:eastAsia="Times New Roman" w:hAnsiTheme="majorBidi" w:cstheme="majorBidi"/>
+          <w:b/>
+          <w:bCs/>
           <w:sz w:val="24"/>
           <w:szCs w:val="24"/>
           <w:bdr w:val="none" w:sz="0" w:space="0" w:color="auto" w:frame="1"/>
@@ -672,8 +647,7 @@
       </w:r>
       <w:r>
         <w:rPr>
-          <w:rFonts w:ascii="Times New Roman" w:eastAsia="Times New Roman" w:hAnsi="Times New Roman" w:cs="Times New Roman"/>
-          <w:color w:val="1F1F1F"/>
+          <w:rFonts w:asciiTheme="majorBidi" w:eastAsia="Times New Roman" w:hAnsiTheme="majorBidi" w:cstheme="majorBidi"/>
           <w:sz w:val="24"/>
           <w:szCs w:val="24"/>
           <w:bdr w:val="none" w:sz="0" w:space="0" w:color="auto" w:frame="1"/>
@@ -683,8 +657,7 @@
       </w:r>
       <w:r>
         <w:rPr>
-          <w:rFonts w:ascii="Times New Roman" w:eastAsia="Times New Roman" w:hAnsi="Times New Roman" w:cs="Times New Roman"/>
-          <w:color w:val="1F1F1F"/>
+          <w:rFonts w:asciiTheme="majorBidi" w:eastAsia="Times New Roman" w:hAnsiTheme="majorBidi" w:cstheme="majorBidi"/>
           <w:sz w:val="24"/>
           <w:szCs w:val="24"/>
           <w:lang w:bidi="ar-SA"/>
@@ -700,19 +673,17 @@
         </w:numPr>
         <w:spacing w:before="100" w:beforeAutospacing="1" w:after="0" w:line="240" w:lineRule="auto"/>
         <w:rPr>
-          <w:rFonts w:ascii="Times New Roman" w:eastAsia="Times New Roman" w:hAnsi="Times New Roman" w:cs="Times New Roman"/>
-          <w:color w:val="1F1F1F"/>
-          <w:sz w:val="24"/>
-          <w:szCs w:val="24"/>
-          <w:lang w:bidi="ar-SA"/>
-        </w:rPr>
-      </w:pPr>
-      <w:r>
-        <w:rPr>
-          <w:rFonts w:ascii="Times New Roman" w:eastAsia="Times New Roman" w:hAnsi="Times New Roman" w:cs="Times New Roman"/>
-          <w:b/>
-          <w:bCs/>
-          <w:color w:val="1F1F1F"/>
+          <w:rFonts w:asciiTheme="majorBidi" w:eastAsia="Times New Roman" w:hAnsiTheme="majorBidi" w:cstheme="majorBidi"/>
+          <w:sz w:val="24"/>
+          <w:szCs w:val="24"/>
+          <w:lang w:bidi="ar-SA"/>
+        </w:rPr>
+      </w:pPr>
+      <w:r>
+        <w:rPr>
+          <w:rFonts w:asciiTheme="majorBidi" w:eastAsia="Times New Roman" w:hAnsiTheme="majorBidi" w:cstheme="majorBidi"/>
+          <w:b/>
+          <w:bCs/>
           <w:sz w:val="24"/>
           <w:szCs w:val="24"/>
           <w:bdr w:val="none" w:sz="0" w:space="0" w:color="auto" w:frame="1"/>
@@ -722,8 +693,7 @@
       </w:r>
       <w:r>
         <w:rPr>
-          <w:rFonts w:ascii="Times New Roman" w:eastAsia="Times New Roman" w:hAnsi="Times New Roman" w:cs="Times New Roman"/>
-          <w:color w:val="1F1F1F"/>
+          <w:rFonts w:asciiTheme="majorBidi" w:eastAsia="Times New Roman" w:hAnsiTheme="majorBidi" w:cstheme="majorBidi"/>
           <w:sz w:val="24"/>
           <w:szCs w:val="24"/>
           <w:bdr w:val="none" w:sz="0" w:space="0" w:color="auto" w:frame="1"/>
@@ -733,8 +703,7 @@
       </w:r>
       <w:r>
         <w:rPr>
-          <w:rFonts w:ascii="Times New Roman" w:eastAsia="Times New Roman" w:hAnsi="Times New Roman" w:cs="Times New Roman"/>
-          <w:color w:val="1F1F1F"/>
+          <w:rFonts w:asciiTheme="majorBidi" w:eastAsia="Times New Roman" w:hAnsiTheme="majorBidi" w:cstheme="majorBidi"/>
           <w:sz w:val="24"/>
           <w:szCs w:val="24"/>
           <w:lang w:bidi="ar-SA"/>
@@ -748,21 +717,19 @@
         <w:jc w:val="center"/>
         <w:outlineLvl w:val="3"/>
         <w:rPr>
-          <w:rFonts w:ascii="Times New Roman" w:eastAsia="Times New Roman" w:hAnsi="Times New Roman" w:cs="Times New Roman"/>
-          <w:b/>
-          <w:bCs/>
-          <w:color w:val="1F1F1F"/>
-          <w:sz w:val="24"/>
-          <w:szCs w:val="24"/>
-          <w:lang w:bidi="ar-SA"/>
-        </w:rPr>
-      </w:pPr>
-      <w:r>
-        <w:rPr>
-          <w:rFonts w:ascii="Times New Roman" w:eastAsia="Times New Roman" w:hAnsi="Times New Roman" w:cs="Times New Roman"/>
-          <w:b/>
-          <w:bCs/>
-          <w:color w:val="1F1F1F"/>
+          <w:rFonts w:asciiTheme="majorBidi" w:eastAsia="Times New Roman" w:hAnsiTheme="majorBidi" w:cstheme="majorBidi"/>
+          <w:b/>
+          <w:bCs/>
+          <w:sz w:val="24"/>
+          <w:szCs w:val="24"/>
+          <w:lang w:bidi="ar-SA"/>
+        </w:rPr>
+      </w:pPr>
+      <w:r>
+        <w:rPr>
+          <w:rFonts w:asciiTheme="majorBidi" w:eastAsia="Times New Roman" w:hAnsiTheme="majorBidi" w:cstheme="majorBidi"/>
+          <w:b/>
+          <w:bCs/>
           <w:sz w:val="24"/>
           <w:szCs w:val="24"/>
           <w:lang w:bidi="ar-SA"/>
@@ -774,17 +741,15 @@
       <w:pPr>
         <w:spacing w:before="100" w:beforeAutospacing="1" w:after="0" w:line="240" w:lineRule="auto"/>
         <w:rPr>
-          <w:rFonts w:ascii="Times New Roman" w:eastAsia="Times New Roman" w:hAnsi="Times New Roman" w:cs="Times New Roman"/>
-          <w:color w:val="1F1F1F"/>
-          <w:sz w:val="24"/>
-          <w:szCs w:val="24"/>
-          <w:lang w:bidi="ar-SA"/>
-        </w:rPr>
-      </w:pPr>
-      <w:r>
-        <w:rPr>
-          <w:rFonts w:ascii="Times New Roman" w:eastAsia="Times New Roman" w:hAnsi="Times New Roman" w:cs="Times New Roman"/>
-          <w:color w:val="1F1F1F"/>
+          <w:rFonts w:asciiTheme="majorBidi" w:eastAsia="Times New Roman" w:hAnsiTheme="majorBidi" w:cstheme="majorBidi"/>
+          <w:sz w:val="24"/>
+          <w:szCs w:val="24"/>
+          <w:lang w:bidi="ar-SA"/>
+        </w:rPr>
+      </w:pPr>
+      <w:r>
+        <w:rPr>
+          <w:rFonts w:asciiTheme="majorBidi" w:eastAsia="Times New Roman" w:hAnsiTheme="majorBidi" w:cstheme="majorBidi"/>
           <w:sz w:val="24"/>
           <w:szCs w:val="24"/>
           <w:lang w:bidi="ar-SA"/>
@@ -796,17 +761,17 @@
       <w:pPr>
         <w:spacing w:line="240" w:lineRule="auto"/>
         <w:rPr>
-          <w:rFonts w:ascii="Times New Roman" w:eastAsia="Times New Roman" w:hAnsi="Times New Roman" w:cs="Times New Roman"/>
-          <w:b/>
-          <w:bCs/>
-          <w:sz w:val="24"/>
-          <w:szCs w:val="24"/>
-          <w:lang w:bidi="ar-SA"/>
-        </w:rPr>
-      </w:pPr>
-      <w:r>
-        <w:rPr>
-          <w:rFonts w:ascii="Times New Roman" w:eastAsia="Times New Roman" w:hAnsi="Times New Roman" w:cs="Times New Roman"/>
+          <w:rFonts w:asciiTheme="majorBidi" w:eastAsia="Times New Roman" w:hAnsiTheme="majorBidi" w:cstheme="majorBidi"/>
+          <w:b/>
+          <w:bCs/>
+          <w:sz w:val="24"/>
+          <w:szCs w:val="24"/>
+          <w:lang w:bidi="ar-SA"/>
+        </w:rPr>
+      </w:pPr>
+      <w:r>
+        <w:rPr>
+          <w:rFonts w:asciiTheme="majorBidi" w:eastAsia="Times New Roman" w:hAnsiTheme="majorBidi" w:cstheme="majorBidi"/>
           <w:b/>
           <w:bCs/>
           <w:sz w:val="24"/>
@@ -820,15 +785,15 @@
       <w:pPr>
         <w:spacing w:line="240" w:lineRule="auto"/>
         <w:rPr>
-          <w:rFonts w:ascii="Times New Roman" w:eastAsia="Times New Roman" w:hAnsi="Times New Roman" w:cs="Times New Roman"/>
-          <w:sz w:val="24"/>
-          <w:szCs w:val="24"/>
-          <w:lang w:bidi="ar-SA"/>
-        </w:rPr>
-      </w:pPr>
-      <w:r>
-        <w:rPr>
-          <w:rFonts w:ascii="Times New Roman" w:eastAsia="Times New Roman" w:hAnsi="Times New Roman" w:cs="Times New Roman"/>
+          <w:rFonts w:asciiTheme="majorBidi" w:eastAsia="Times New Roman" w:hAnsiTheme="majorBidi" w:cstheme="majorBidi"/>
+          <w:sz w:val="24"/>
+          <w:szCs w:val="24"/>
+          <w:lang w:bidi="ar-SA"/>
+        </w:rPr>
+      </w:pPr>
+      <w:r>
+        <w:rPr>
+          <w:rFonts w:asciiTheme="majorBidi" w:eastAsia="Times New Roman" w:hAnsiTheme="majorBidi" w:cstheme="majorBidi"/>
           <w:sz w:val="24"/>
           <w:szCs w:val="24"/>
           <w:lang w:bidi="ar-SA"/>
@@ -844,15 +809,15 @@
         </w:numPr>
         <w:spacing w:after="0" w:line="240" w:lineRule="auto"/>
         <w:rPr>
-          <w:rFonts w:ascii="Times New Roman" w:eastAsia="Times New Roman" w:hAnsi="Times New Roman" w:cs="Times New Roman"/>
-          <w:sz w:val="24"/>
-          <w:szCs w:val="24"/>
-          <w:lang w:bidi="ar-SA"/>
-        </w:rPr>
-      </w:pPr>
-      <w:r>
-        <w:rPr>
-          <w:rFonts w:ascii="Times New Roman" w:eastAsia="Times New Roman" w:hAnsi="Times New Roman" w:cs="Times New Roman"/>
+          <w:rFonts w:asciiTheme="majorBidi" w:eastAsia="Times New Roman" w:hAnsiTheme="majorBidi" w:cstheme="majorBidi"/>
+          <w:sz w:val="24"/>
+          <w:szCs w:val="24"/>
+          <w:lang w:bidi="ar-SA"/>
+        </w:rPr>
+      </w:pPr>
+      <w:r>
+        <w:rPr>
+          <w:rFonts w:asciiTheme="majorBidi" w:eastAsia="Times New Roman" w:hAnsiTheme="majorBidi" w:cstheme="majorBidi"/>
           <w:b/>
           <w:bCs/>
           <w:sz w:val="24"/>
@@ -863,7 +828,7 @@
       </w:r>
       <w:r>
         <w:rPr>
-          <w:rFonts w:ascii="Times New Roman" w:eastAsia="Times New Roman" w:hAnsi="Times New Roman" w:cs="Times New Roman"/>
+          <w:rFonts w:asciiTheme="majorBidi" w:eastAsia="Times New Roman" w:hAnsiTheme="majorBidi" w:cstheme="majorBidi"/>
           <w:sz w:val="24"/>
           <w:szCs w:val="24"/>
           <w:lang w:bidi="ar-SA"/>
@@ -879,15 +844,15 @@
         </w:numPr>
         <w:spacing w:after="0" w:line="240" w:lineRule="auto"/>
         <w:rPr>
-          <w:rFonts w:ascii="Times New Roman" w:eastAsia="Times New Roman" w:hAnsi="Times New Roman" w:cs="Times New Roman"/>
-          <w:sz w:val="24"/>
-          <w:szCs w:val="24"/>
-          <w:lang w:bidi="ar-SA"/>
-        </w:rPr>
-      </w:pPr>
-      <w:r>
-        <w:rPr>
-          <w:rFonts w:ascii="Times New Roman" w:eastAsia="Times New Roman" w:hAnsi="Times New Roman" w:cs="Times New Roman"/>
+          <w:rFonts w:asciiTheme="majorBidi" w:eastAsia="Times New Roman" w:hAnsiTheme="majorBidi" w:cstheme="majorBidi"/>
+          <w:sz w:val="24"/>
+          <w:szCs w:val="24"/>
+          <w:lang w:bidi="ar-SA"/>
+        </w:rPr>
+      </w:pPr>
+      <w:r>
+        <w:rPr>
+          <w:rFonts w:asciiTheme="majorBidi" w:eastAsia="Times New Roman" w:hAnsiTheme="majorBidi" w:cstheme="majorBidi"/>
           <w:b/>
           <w:bCs/>
           <w:sz w:val="24"/>
@@ -898,7 +863,7 @@
       </w:r>
       <w:r>
         <w:rPr>
-          <w:rFonts w:ascii="Times New Roman" w:eastAsia="Times New Roman" w:hAnsi="Times New Roman" w:cs="Times New Roman"/>
+          <w:rFonts w:asciiTheme="majorBidi" w:eastAsia="Times New Roman" w:hAnsiTheme="majorBidi" w:cstheme="majorBidi"/>
           <w:sz w:val="24"/>
           <w:szCs w:val="24"/>
           <w:lang w:bidi="ar-SA"/>
@@ -914,15 +879,15 @@
         </w:numPr>
         <w:spacing w:after="0" w:line="240" w:lineRule="auto"/>
         <w:rPr>
-          <w:rFonts w:ascii="Times New Roman" w:eastAsia="Times New Roman" w:hAnsi="Times New Roman" w:cs="Times New Roman"/>
-          <w:sz w:val="24"/>
-          <w:szCs w:val="24"/>
-          <w:lang w:bidi="ar-SA"/>
-        </w:rPr>
-      </w:pPr>
-      <w:r>
-        <w:rPr>
-          <w:rFonts w:ascii="Times New Roman" w:eastAsia="Times New Roman" w:hAnsi="Times New Roman" w:cs="Times New Roman"/>
+          <w:rFonts w:asciiTheme="majorBidi" w:eastAsia="Times New Roman" w:hAnsiTheme="majorBidi" w:cstheme="majorBidi"/>
+          <w:sz w:val="24"/>
+          <w:szCs w:val="24"/>
+          <w:lang w:bidi="ar-SA"/>
+        </w:rPr>
+      </w:pPr>
+      <w:r>
+        <w:rPr>
+          <w:rFonts w:asciiTheme="majorBidi" w:eastAsia="Times New Roman" w:hAnsiTheme="majorBidi" w:cstheme="majorBidi"/>
           <w:b/>
           <w:bCs/>
           <w:sz w:val="24"/>
@@ -933,7 +898,7 @@
       </w:r>
       <w:r>
         <w:rPr>
-          <w:rFonts w:ascii="Times New Roman" w:eastAsia="Times New Roman" w:hAnsi="Times New Roman" w:cs="Times New Roman"/>
+          <w:rFonts w:asciiTheme="majorBidi" w:eastAsia="Times New Roman" w:hAnsiTheme="majorBidi" w:cstheme="majorBidi"/>
           <w:sz w:val="24"/>
           <w:szCs w:val="24"/>
           <w:lang w:bidi="ar-SA"/>
@@ -945,15 +910,15 @@
       <w:pPr>
         <w:spacing w:after="0" w:line="240" w:lineRule="auto"/>
         <w:rPr>
-          <w:rFonts w:ascii="Times New Roman" w:eastAsia="Times New Roman" w:hAnsi="Times New Roman" w:cs="Times New Roman"/>
-          <w:sz w:val="24"/>
-          <w:szCs w:val="24"/>
-          <w:lang w:bidi="ar-SA"/>
-        </w:rPr>
-      </w:pPr>
-      <w:r>
-        <w:rPr>
-          <w:rFonts w:ascii="Times New Roman" w:eastAsia="Times New Roman" w:hAnsi="Times New Roman" w:cs="Times New Roman"/>
+          <w:rFonts w:asciiTheme="majorBidi" w:eastAsia="Times New Roman" w:hAnsiTheme="majorBidi" w:cstheme="majorBidi"/>
+          <w:sz w:val="24"/>
+          <w:szCs w:val="24"/>
+          <w:lang w:bidi="ar-SA"/>
+        </w:rPr>
+      </w:pPr>
+      <w:r>
+        <w:rPr>
+          <w:rFonts w:asciiTheme="majorBidi" w:eastAsia="Times New Roman" w:hAnsiTheme="majorBidi" w:cstheme="majorBidi"/>
           <w:b/>
           <w:bCs/>
           <w:i/>
@@ -966,7 +931,7 @@
       </w:r>
       <w:r>
         <w:rPr>
-          <w:rFonts w:ascii="Times New Roman" w:eastAsia="Times New Roman" w:hAnsi="Times New Roman" w:cs="Times New Roman"/>
+          <w:rFonts w:asciiTheme="majorBidi" w:eastAsia="Times New Roman" w:hAnsiTheme="majorBidi" w:cstheme="majorBidi"/>
           <w:i/>
           <w:iCs/>
           <w:sz w:val="24"/>
@@ -977,7 +942,7 @@
       </w:r>
       <w:r>
         <w:rPr>
-          <w:rFonts w:ascii="Times New Roman" w:eastAsia="Times New Roman" w:hAnsi="Times New Roman" w:cs="Times New Roman"/>
+          <w:rFonts w:asciiTheme="majorBidi" w:eastAsia="Times New Roman" w:hAnsiTheme="majorBidi" w:cstheme="majorBidi"/>
           <w:sz w:val="24"/>
           <w:szCs w:val="24"/>
           <w:lang w:bidi="ar-SA"/>
@@ -986,7 +951,7 @@
       </w:r>
       <w:r>
         <w:rPr>
-          <w:rFonts w:ascii="Times New Roman" w:eastAsia="Times New Roman" w:hAnsi="Times New Roman" w:cs="Times New Roman"/>
+          <w:rFonts w:asciiTheme="majorBidi" w:eastAsia="Times New Roman" w:hAnsiTheme="majorBidi" w:cstheme="majorBidi"/>
           <w:sz w:val="24"/>
           <w:szCs w:val="24"/>
           <w:lang w:bidi="ar-SA"/>
@@ -998,7 +963,7 @@
       <w:pPr>
         <w:spacing w:after="0" w:line="240" w:lineRule="auto"/>
         <w:rPr>
-          <w:rFonts w:ascii="Times New Roman" w:eastAsia="Times New Roman" w:hAnsi="Times New Roman" w:cs="Times New Roman"/>
+          <w:rFonts w:asciiTheme="majorBidi" w:eastAsia="Times New Roman" w:hAnsiTheme="majorBidi" w:cstheme="majorBidi"/>
           <w:sz w:val="24"/>
           <w:szCs w:val="24"/>
           <w:lang w:bidi="ar-SA"/>
@@ -1009,17 +974,17 @@
       <w:pPr>
         <w:spacing w:line="240" w:lineRule="auto"/>
         <w:rPr>
-          <w:rFonts w:ascii="Times New Roman" w:eastAsia="Times New Roman" w:hAnsi="Times New Roman" w:cs="Times New Roman"/>
-          <w:b/>
-          <w:bCs/>
-          <w:sz w:val="24"/>
-          <w:szCs w:val="24"/>
-          <w:lang w:bidi="ar-SA"/>
-        </w:rPr>
-      </w:pPr>
-      <w:r>
-        <w:rPr>
-          <w:rFonts w:ascii="Times New Roman" w:eastAsia="Times New Roman" w:hAnsi="Times New Roman" w:cs="Times New Roman"/>
+          <w:rFonts w:asciiTheme="majorBidi" w:eastAsia="Times New Roman" w:hAnsiTheme="majorBidi" w:cstheme="majorBidi"/>
+          <w:b/>
+          <w:bCs/>
+          <w:sz w:val="24"/>
+          <w:szCs w:val="24"/>
+          <w:lang w:bidi="ar-SA"/>
+        </w:rPr>
+      </w:pPr>
+      <w:r>
+        <w:rPr>
+          <w:rFonts w:asciiTheme="majorBidi" w:eastAsia="Times New Roman" w:hAnsiTheme="majorBidi" w:cstheme="majorBidi"/>
           <w:b/>
           <w:bCs/>
           <w:sz w:val="24"/>
@@ -1033,19 +998,20 @@
       <w:pPr>
         <w:spacing w:line="240" w:lineRule="auto"/>
         <w:rPr>
-          <w:rFonts w:ascii="Times New Roman" w:eastAsia="Times New Roman" w:hAnsi="Times New Roman" w:cs="Times New Roman"/>
-          <w:sz w:val="24"/>
-          <w:szCs w:val="24"/>
-          <w:lang w:bidi="ar-SA"/>
-        </w:rPr>
-      </w:pPr>
-      <w:r>
-        <w:rPr>
-          <w:rFonts w:ascii="Times New Roman" w:eastAsia="Times New Roman" w:hAnsi="Times New Roman" w:cs="Times New Roman"/>
-          <w:sz w:val="24"/>
-          <w:szCs w:val="24"/>
-          <w:lang w:bidi="ar-SA"/>
-        </w:rPr>
+          <w:rFonts w:asciiTheme="majorBidi" w:eastAsia="Times New Roman" w:hAnsiTheme="majorBidi" w:cstheme="majorBidi"/>
+          <w:sz w:val="24"/>
+          <w:szCs w:val="24"/>
+          <w:lang w:bidi="ar-SA"/>
+        </w:rPr>
+      </w:pPr>
+      <w:r>
+        <w:rPr>
+          <w:rFonts w:asciiTheme="majorBidi" w:eastAsia="Times New Roman" w:hAnsiTheme="majorBidi" w:cstheme="majorBidi"/>
+          <w:sz w:val="24"/>
+          <w:szCs w:val="24"/>
+          <w:lang w:bidi="ar-SA"/>
+        </w:rPr>
+        <w:lastRenderedPageBreak/>
         <w:t>Introduces estimation and scheduling to help you make realistic, achievable commitments.</w:t>
       </w:r>
     </w:p>
@@ -1057,27 +1023,26 @@
         </w:numPr>
         <w:spacing w:after="0" w:line="240" w:lineRule="auto"/>
         <w:rPr>
-          <w:rFonts w:ascii="Times New Roman" w:eastAsia="Times New Roman" w:hAnsi="Times New Roman" w:cs="Times New Roman"/>
-          <w:sz w:val="24"/>
-          <w:szCs w:val="24"/>
-          <w:lang w:bidi="ar-SA"/>
-        </w:rPr>
-      </w:pPr>
-      <w:r>
-        <w:rPr>
-          <w:rFonts w:ascii="Times New Roman" w:eastAsia="Times New Roman" w:hAnsi="Times New Roman" w:cs="Times New Roman"/>
-          <w:b/>
-          <w:bCs/>
-          <w:sz w:val="24"/>
-          <w:szCs w:val="24"/>
-          <w:lang w:bidi="ar-SA"/>
-        </w:rPr>
-        <w:lastRenderedPageBreak/>
+          <w:rFonts w:asciiTheme="majorBidi" w:eastAsia="Times New Roman" w:hAnsiTheme="majorBidi" w:cstheme="majorBidi"/>
+          <w:sz w:val="24"/>
+          <w:szCs w:val="24"/>
+          <w:lang w:bidi="ar-SA"/>
+        </w:rPr>
+      </w:pPr>
+      <w:r>
+        <w:rPr>
+          <w:rFonts w:asciiTheme="majorBidi" w:eastAsia="Times New Roman" w:hAnsiTheme="majorBidi" w:cstheme="majorBidi"/>
+          <w:b/>
+          <w:bCs/>
+          <w:sz w:val="24"/>
+          <w:szCs w:val="24"/>
+          <w:lang w:bidi="ar-SA"/>
+        </w:rPr>
         <w:t>Size Estimating:</w:t>
       </w:r>
       <w:r>
         <w:rPr>
-          <w:rFonts w:ascii="Times New Roman" w:eastAsia="Times New Roman" w:hAnsi="Times New Roman" w:cs="Times New Roman"/>
+          <w:rFonts w:asciiTheme="majorBidi" w:eastAsia="Times New Roman" w:hAnsiTheme="majorBidi" w:cstheme="majorBidi"/>
           <w:sz w:val="24"/>
           <w:szCs w:val="24"/>
           <w:lang w:bidi="ar-SA"/>
@@ -1093,15 +1058,15 @@
         </w:numPr>
         <w:spacing w:after="0" w:line="240" w:lineRule="auto"/>
         <w:rPr>
-          <w:rFonts w:ascii="Times New Roman" w:eastAsia="Times New Roman" w:hAnsi="Times New Roman" w:cs="Times New Roman"/>
-          <w:sz w:val="24"/>
-          <w:szCs w:val="24"/>
-          <w:lang w:bidi="ar-SA"/>
-        </w:rPr>
-      </w:pPr>
-      <w:r>
-        <w:rPr>
-          <w:rFonts w:ascii="Times New Roman" w:eastAsia="Times New Roman" w:hAnsi="Times New Roman" w:cs="Times New Roman"/>
+          <w:rFonts w:asciiTheme="majorBidi" w:eastAsia="Times New Roman" w:hAnsiTheme="majorBidi" w:cstheme="majorBidi"/>
+          <w:sz w:val="24"/>
+          <w:szCs w:val="24"/>
+          <w:lang w:bidi="ar-SA"/>
+        </w:rPr>
+      </w:pPr>
+      <w:r>
+        <w:rPr>
+          <w:rFonts w:asciiTheme="majorBidi" w:eastAsia="Times New Roman" w:hAnsiTheme="majorBidi" w:cstheme="majorBidi"/>
           <w:b/>
           <w:bCs/>
           <w:sz w:val="24"/>
@@ -1112,7 +1077,7 @@
       </w:r>
       <w:r>
         <w:rPr>
-          <w:rFonts w:ascii="Times New Roman" w:eastAsia="Times New Roman" w:hAnsi="Times New Roman" w:cs="Times New Roman"/>
+          <w:rFonts w:asciiTheme="majorBidi" w:eastAsia="Times New Roman" w:hAnsiTheme="majorBidi" w:cstheme="majorBidi"/>
           <w:sz w:val="24"/>
           <w:szCs w:val="24"/>
           <w:lang w:bidi="ar-SA"/>
@@ -1128,15 +1093,15 @@
         </w:numPr>
         <w:spacing w:after="0" w:line="240" w:lineRule="auto"/>
         <w:rPr>
-          <w:rFonts w:ascii="Times New Roman" w:eastAsia="Times New Roman" w:hAnsi="Times New Roman" w:cs="Times New Roman"/>
-          <w:sz w:val="24"/>
-          <w:szCs w:val="24"/>
-          <w:lang w:bidi="ar-SA"/>
-        </w:rPr>
-      </w:pPr>
-      <w:r>
-        <w:rPr>
-          <w:rFonts w:ascii="Times New Roman" w:eastAsia="Times New Roman" w:hAnsi="Times New Roman" w:cs="Times New Roman"/>
+          <w:rFonts w:asciiTheme="majorBidi" w:eastAsia="Times New Roman" w:hAnsiTheme="majorBidi" w:cstheme="majorBidi"/>
+          <w:sz w:val="24"/>
+          <w:szCs w:val="24"/>
+          <w:lang w:bidi="ar-SA"/>
+        </w:rPr>
+      </w:pPr>
+      <w:r>
+        <w:rPr>
+          <w:rFonts w:asciiTheme="majorBidi" w:eastAsia="Times New Roman" w:hAnsiTheme="majorBidi" w:cstheme="majorBidi"/>
           <w:i/>
           <w:iCs/>
           <w:sz w:val="24"/>
@@ -1147,7 +1112,7 @@
       </w:r>
       <w:r>
         <w:rPr>
-          <w:rFonts w:ascii="Times New Roman" w:eastAsia="Times New Roman" w:hAnsi="Times New Roman" w:cs="Times New Roman"/>
+          <w:rFonts w:asciiTheme="majorBidi" w:eastAsia="Times New Roman" w:hAnsiTheme="majorBidi" w:cstheme="majorBidi"/>
           <w:sz w:val="24"/>
           <w:szCs w:val="24"/>
           <w:lang w:bidi="ar-SA"/>
@@ -1160,7 +1125,7 @@
         <w:spacing w:after="0" w:line="240" w:lineRule="auto"/>
         <w:ind w:left="360"/>
         <w:rPr>
-          <w:rFonts w:ascii="Times New Roman" w:eastAsia="Times New Roman" w:hAnsi="Times New Roman" w:cs="Times New Roman"/>
+          <w:rFonts w:asciiTheme="majorBidi" w:eastAsia="Times New Roman" w:hAnsiTheme="majorBidi" w:cstheme="majorBidi"/>
           <w:sz w:val="24"/>
           <w:szCs w:val="24"/>
           <w:lang w:bidi="ar-SA"/>
@@ -1171,17 +1136,17 @@
       <w:pPr>
         <w:spacing w:line="240" w:lineRule="auto"/>
         <w:rPr>
-          <w:rFonts w:ascii="Times New Roman" w:eastAsia="Times New Roman" w:hAnsi="Times New Roman" w:cs="Times New Roman"/>
-          <w:b/>
-          <w:bCs/>
-          <w:sz w:val="24"/>
-          <w:szCs w:val="24"/>
-          <w:lang w:bidi="ar-SA"/>
-        </w:rPr>
-      </w:pPr>
-      <w:r>
-        <w:rPr>
-          <w:rFonts w:ascii="Times New Roman" w:eastAsia="Times New Roman" w:hAnsi="Times New Roman" w:cs="Times New Roman"/>
+          <w:rFonts w:asciiTheme="majorBidi" w:eastAsia="Times New Roman" w:hAnsiTheme="majorBidi" w:cstheme="majorBidi"/>
+          <w:b/>
+          <w:bCs/>
+          <w:sz w:val="24"/>
+          <w:szCs w:val="24"/>
+          <w:lang w:bidi="ar-SA"/>
+        </w:rPr>
+      </w:pPr>
+      <w:r>
+        <w:rPr>
+          <w:rFonts w:asciiTheme="majorBidi" w:eastAsia="Times New Roman" w:hAnsiTheme="majorBidi" w:cstheme="majorBidi"/>
           <w:b/>
           <w:bCs/>
           <w:sz w:val="24"/>
@@ -1195,15 +1160,15 @@
       <w:pPr>
         <w:spacing w:line="240" w:lineRule="auto"/>
         <w:rPr>
-          <w:rFonts w:ascii="Times New Roman" w:eastAsia="Times New Roman" w:hAnsi="Times New Roman" w:cs="Times New Roman"/>
-          <w:sz w:val="24"/>
-          <w:szCs w:val="24"/>
-          <w:lang w:bidi="ar-SA"/>
-        </w:rPr>
-      </w:pPr>
-      <w:r>
-        <w:rPr>
-          <w:rFonts w:ascii="Times New Roman" w:eastAsia="Times New Roman" w:hAnsi="Times New Roman" w:cs="Times New Roman"/>
+          <w:rFonts w:asciiTheme="majorBidi" w:eastAsia="Times New Roman" w:hAnsiTheme="majorBidi" w:cstheme="majorBidi"/>
+          <w:sz w:val="24"/>
+          <w:szCs w:val="24"/>
+          <w:lang w:bidi="ar-SA"/>
+        </w:rPr>
+      </w:pPr>
+      <w:r>
+        <w:rPr>
+          <w:rFonts w:asciiTheme="majorBidi" w:eastAsia="Times New Roman" w:hAnsiTheme="majorBidi" w:cstheme="majorBidi"/>
           <w:sz w:val="24"/>
           <w:szCs w:val="24"/>
           <w:lang w:bidi="ar-SA"/>
@@ -1219,15 +1184,15 @@
         </w:numPr>
         <w:spacing w:after="0" w:line="240" w:lineRule="auto"/>
         <w:rPr>
-          <w:rFonts w:ascii="Times New Roman" w:eastAsia="Times New Roman" w:hAnsi="Times New Roman" w:cs="Times New Roman"/>
-          <w:sz w:val="24"/>
-          <w:szCs w:val="24"/>
-          <w:lang w:bidi="ar-SA"/>
-        </w:rPr>
-      </w:pPr>
-      <w:r>
-        <w:rPr>
-          <w:rFonts w:ascii="Times New Roman" w:eastAsia="Times New Roman" w:hAnsi="Times New Roman" w:cs="Times New Roman"/>
+          <w:rFonts w:asciiTheme="majorBidi" w:eastAsia="Times New Roman" w:hAnsiTheme="majorBidi" w:cstheme="majorBidi"/>
+          <w:sz w:val="24"/>
+          <w:szCs w:val="24"/>
+          <w:lang w:bidi="ar-SA"/>
+        </w:rPr>
+      </w:pPr>
+      <w:r>
+        <w:rPr>
+          <w:rFonts w:asciiTheme="majorBidi" w:eastAsia="Times New Roman" w:hAnsiTheme="majorBidi" w:cstheme="majorBidi"/>
           <w:b/>
           <w:bCs/>
           <w:sz w:val="24"/>
@@ -1238,7 +1203,7 @@
       </w:r>
       <w:r>
         <w:rPr>
-          <w:rFonts w:ascii="Times New Roman" w:eastAsia="Times New Roman" w:hAnsi="Times New Roman" w:cs="Times New Roman"/>
+          <w:rFonts w:asciiTheme="majorBidi" w:eastAsia="Times New Roman" w:hAnsiTheme="majorBidi" w:cstheme="majorBidi"/>
           <w:sz w:val="24"/>
           <w:szCs w:val="24"/>
           <w:lang w:bidi="ar-SA"/>
@@ -1254,15 +1219,15 @@
         </w:numPr>
         <w:spacing w:after="0" w:line="240" w:lineRule="auto"/>
         <w:rPr>
-          <w:rFonts w:ascii="Times New Roman" w:eastAsia="Times New Roman" w:hAnsi="Times New Roman" w:cs="Times New Roman"/>
-          <w:sz w:val="24"/>
-          <w:szCs w:val="24"/>
-          <w:lang w:bidi="ar-SA"/>
-        </w:rPr>
-      </w:pPr>
-      <w:r>
-        <w:rPr>
-          <w:rFonts w:ascii="Times New Roman" w:eastAsia="Times New Roman" w:hAnsi="Times New Roman" w:cs="Times New Roman"/>
+          <w:rFonts w:asciiTheme="majorBidi" w:eastAsia="Times New Roman" w:hAnsiTheme="majorBidi" w:cstheme="majorBidi"/>
+          <w:sz w:val="24"/>
+          <w:szCs w:val="24"/>
+          <w:lang w:bidi="ar-SA"/>
+        </w:rPr>
+      </w:pPr>
+      <w:r>
+        <w:rPr>
+          <w:rFonts w:asciiTheme="majorBidi" w:eastAsia="Times New Roman" w:hAnsiTheme="majorBidi" w:cstheme="majorBidi"/>
           <w:b/>
           <w:bCs/>
           <w:sz w:val="24"/>
@@ -1273,7 +1238,7 @@
       </w:r>
       <w:r>
         <w:rPr>
-          <w:rFonts w:ascii="Times New Roman" w:eastAsia="Times New Roman" w:hAnsi="Times New Roman" w:cs="Times New Roman"/>
+          <w:rFonts w:asciiTheme="majorBidi" w:eastAsia="Times New Roman" w:hAnsiTheme="majorBidi" w:cstheme="majorBidi"/>
           <w:sz w:val="24"/>
           <w:szCs w:val="24"/>
           <w:lang w:bidi="ar-SA"/>
@@ -1289,15 +1254,15 @@
         </w:numPr>
         <w:spacing w:after="0" w:line="240" w:lineRule="auto"/>
         <w:rPr>
-          <w:rFonts w:ascii="Times New Roman" w:eastAsia="Times New Roman" w:hAnsi="Times New Roman" w:cs="Times New Roman"/>
-          <w:sz w:val="24"/>
-          <w:szCs w:val="24"/>
-          <w:lang w:bidi="ar-SA"/>
-        </w:rPr>
-      </w:pPr>
-      <w:r>
-        <w:rPr>
-          <w:rFonts w:ascii="Times New Roman" w:eastAsia="Times New Roman" w:hAnsi="Times New Roman" w:cs="Times New Roman"/>
+          <w:rFonts w:asciiTheme="majorBidi" w:eastAsia="Times New Roman" w:hAnsiTheme="majorBidi" w:cstheme="majorBidi"/>
+          <w:sz w:val="24"/>
+          <w:szCs w:val="24"/>
+          <w:lang w:bidi="ar-SA"/>
+        </w:rPr>
+      </w:pPr>
+      <w:r>
+        <w:rPr>
+          <w:rFonts w:asciiTheme="majorBidi" w:eastAsia="Times New Roman" w:hAnsiTheme="majorBidi" w:cstheme="majorBidi"/>
           <w:i/>
           <w:iCs/>
           <w:sz w:val="24"/>
@@ -1308,7 +1273,7 @@
       </w:r>
       <w:r>
         <w:rPr>
-          <w:rFonts w:ascii="Times New Roman" w:eastAsia="Times New Roman" w:hAnsi="Times New Roman" w:cs="Times New Roman"/>
+          <w:rFonts w:asciiTheme="majorBidi" w:eastAsia="Times New Roman" w:hAnsiTheme="majorBidi" w:cstheme="majorBidi"/>
           <w:sz w:val="24"/>
           <w:szCs w:val="24"/>
           <w:lang w:bidi="ar-SA"/>
@@ -1320,17 +1285,17 @@
       <w:pPr>
         <w:spacing w:line="240" w:lineRule="auto"/>
         <w:rPr>
-          <w:rFonts w:ascii="Times New Roman" w:eastAsia="Times New Roman" w:hAnsi="Times New Roman" w:cs="Times New Roman"/>
-          <w:b/>
-          <w:bCs/>
-          <w:sz w:val="24"/>
-          <w:szCs w:val="24"/>
-          <w:lang w:bidi="ar-SA"/>
-        </w:rPr>
-      </w:pPr>
-      <w:r>
-        <w:rPr>
-          <w:rFonts w:ascii="Times New Roman" w:eastAsia="Times New Roman" w:hAnsi="Times New Roman" w:cs="Times New Roman"/>
+          <w:rFonts w:asciiTheme="majorBidi" w:eastAsia="Times New Roman" w:hAnsiTheme="majorBidi" w:cstheme="majorBidi"/>
+          <w:b/>
+          <w:bCs/>
+          <w:sz w:val="24"/>
+          <w:szCs w:val="24"/>
+          <w:lang w:bidi="ar-SA"/>
+        </w:rPr>
+      </w:pPr>
+      <w:r>
+        <w:rPr>
+          <w:rFonts w:asciiTheme="majorBidi" w:eastAsia="Times New Roman" w:hAnsiTheme="majorBidi" w:cstheme="majorBidi"/>
           <w:b/>
           <w:bCs/>
           <w:sz w:val="24"/>
@@ -1344,15 +1309,15 @@
       <w:pPr>
         <w:spacing w:line="240" w:lineRule="auto"/>
         <w:rPr>
-          <w:rFonts w:ascii="Times New Roman" w:eastAsia="Times New Roman" w:hAnsi="Times New Roman" w:cs="Times New Roman"/>
-          <w:sz w:val="24"/>
-          <w:szCs w:val="24"/>
-          <w:lang w:bidi="ar-SA"/>
-        </w:rPr>
-      </w:pPr>
-      <w:r>
-        <w:rPr>
-          <w:rFonts w:ascii="Times New Roman" w:eastAsia="Times New Roman" w:hAnsi="Times New Roman" w:cs="Times New Roman"/>
+          <w:rFonts w:asciiTheme="majorBidi" w:eastAsia="Times New Roman" w:hAnsiTheme="majorBidi" w:cstheme="majorBidi"/>
+          <w:sz w:val="24"/>
+          <w:szCs w:val="24"/>
+          <w:lang w:bidi="ar-SA"/>
+        </w:rPr>
+      </w:pPr>
+      <w:r>
+        <w:rPr>
+          <w:rFonts w:asciiTheme="majorBidi" w:eastAsia="Times New Roman" w:hAnsiTheme="majorBidi" w:cstheme="majorBidi"/>
           <w:sz w:val="24"/>
           <w:szCs w:val="24"/>
           <w:lang w:bidi="ar-SA"/>
@@ -1368,15 +1333,15 @@
         </w:numPr>
         <w:spacing w:after="0" w:line="240" w:lineRule="auto"/>
         <w:rPr>
-          <w:rFonts w:ascii="Times New Roman" w:eastAsia="Times New Roman" w:hAnsi="Times New Roman" w:cs="Times New Roman"/>
-          <w:sz w:val="24"/>
-          <w:szCs w:val="24"/>
-          <w:lang w:bidi="ar-SA"/>
-        </w:rPr>
-      </w:pPr>
-      <w:r>
-        <w:rPr>
-          <w:rFonts w:ascii="Times New Roman" w:eastAsia="Times New Roman" w:hAnsi="Times New Roman" w:cs="Times New Roman"/>
+          <w:rFonts w:asciiTheme="majorBidi" w:eastAsia="Times New Roman" w:hAnsiTheme="majorBidi" w:cstheme="majorBidi"/>
+          <w:sz w:val="24"/>
+          <w:szCs w:val="24"/>
+          <w:lang w:bidi="ar-SA"/>
+        </w:rPr>
+      </w:pPr>
+      <w:r>
+        <w:rPr>
+          <w:rFonts w:asciiTheme="majorBidi" w:eastAsia="Times New Roman" w:hAnsiTheme="majorBidi" w:cstheme="majorBidi"/>
           <w:b/>
           <w:bCs/>
           <w:sz w:val="24"/>
@@ -1387,7 +1352,7 @@
       </w:r>
       <w:r>
         <w:rPr>
-          <w:rFonts w:ascii="Times New Roman" w:eastAsia="Times New Roman" w:hAnsi="Times New Roman" w:cs="Times New Roman"/>
+          <w:rFonts w:asciiTheme="majorBidi" w:eastAsia="Times New Roman" w:hAnsiTheme="majorBidi" w:cstheme="majorBidi"/>
           <w:sz w:val="24"/>
           <w:szCs w:val="24"/>
           <w:lang w:bidi="ar-SA"/>
@@ -1399,15 +1364,15 @@
       <w:pPr>
         <w:spacing w:before="100" w:beforeAutospacing="1" w:after="0" w:line="240" w:lineRule="auto"/>
         <w:rPr>
-          <w:rFonts w:ascii="Times New Roman" w:eastAsia="Times New Roman" w:hAnsi="Times New Roman" w:cs="Times New Roman"/>
-          <w:sz w:val="24"/>
-          <w:szCs w:val="24"/>
-          <w:lang w:bidi="ar-SA"/>
-        </w:rPr>
-      </w:pPr>
-      <w:r>
-        <w:rPr>
-          <w:rFonts w:ascii="Times New Roman" w:eastAsia="Times New Roman" w:hAnsi="Times New Roman" w:cs="Times New Roman"/>
+          <w:rFonts w:asciiTheme="majorBidi" w:eastAsia="Times New Roman" w:hAnsiTheme="majorBidi" w:cstheme="majorBidi"/>
+          <w:sz w:val="24"/>
+          <w:szCs w:val="24"/>
+          <w:lang w:bidi="ar-SA"/>
+        </w:rPr>
+      </w:pPr>
+      <w:r>
+        <w:rPr>
+          <w:rFonts w:asciiTheme="majorBidi" w:eastAsia="Times New Roman" w:hAnsiTheme="majorBidi" w:cstheme="majorBidi"/>
           <w:b/>
           <w:bCs/>
           <w:sz w:val="24"/>
@@ -1418,7 +1383,7 @@
       </w:r>
       <w:r>
         <w:rPr>
-          <w:rFonts w:ascii="Times New Roman" w:eastAsia="Times New Roman" w:hAnsi="Times New Roman" w:cs="Times New Roman"/>
+          <w:rFonts w:asciiTheme="majorBidi" w:eastAsia="Times New Roman" w:hAnsiTheme="majorBidi" w:cstheme="majorBidi"/>
           <w:sz w:val="24"/>
           <w:szCs w:val="24"/>
           <w:lang w:bidi="ar-SA"/>
@@ -1430,17 +1395,15 @@
       <w:pPr>
         <w:spacing w:before="100" w:beforeAutospacing="1" w:after="0" w:line="240" w:lineRule="auto"/>
         <w:rPr>
-          <w:rFonts w:ascii="Times New Roman" w:eastAsia="Times New Roman" w:hAnsi="Times New Roman" w:cs="Times New Roman"/>
-          <w:color w:val="1F1F1F"/>
-          <w:sz w:val="24"/>
-          <w:szCs w:val="24"/>
-          <w:lang w:bidi="ar-SA"/>
-        </w:rPr>
-      </w:pPr>
-      <w:r>
-        <w:rPr>
-          <w:rFonts w:ascii="Times New Roman" w:eastAsia="Times New Roman" w:hAnsi="Times New Roman" w:cs="Times New Roman"/>
-          <w:color w:val="1F1F1F"/>
+          <w:rFonts w:asciiTheme="majorBidi" w:eastAsia="Times New Roman" w:hAnsiTheme="majorBidi" w:cstheme="majorBidi"/>
+          <w:sz w:val="24"/>
+          <w:szCs w:val="24"/>
+          <w:lang w:bidi="ar-SA"/>
+        </w:rPr>
+      </w:pPr>
+      <w:r>
+        <w:rPr>
+          <w:rFonts w:asciiTheme="majorBidi" w:eastAsia="Times New Roman" w:hAnsiTheme="majorBidi" w:cstheme="majorBidi"/>
           <w:sz w:val="24"/>
           <w:szCs w:val="24"/>
           <w:bdr w:val="none" w:sz="0" w:space="0" w:color="auto" w:frame="1"/>
@@ -1450,8 +1413,7 @@
       </w:r>
       <w:r>
         <w:rPr>
-          <w:rFonts w:ascii="Times New Roman" w:eastAsia="Times New Roman" w:hAnsi="Times New Roman" w:cs="Times New Roman"/>
-          <w:color w:val="1F1F1F"/>
+          <w:rFonts w:asciiTheme="majorBidi" w:eastAsia="Times New Roman" w:hAnsiTheme="majorBidi" w:cstheme="majorBidi"/>
           <w:sz w:val="24"/>
           <w:szCs w:val="24"/>
           <w:lang w:bidi="ar-SA"/>
@@ -1464,21 +1426,19 @@
         <w:spacing w:before="100" w:beforeAutospacing="1" w:after="0" w:line="240" w:lineRule="auto"/>
         <w:outlineLvl w:val="2"/>
         <w:rPr>
-          <w:rFonts w:ascii="Times New Roman" w:eastAsia="Times New Roman" w:hAnsi="Times New Roman" w:cs="Times New Roman"/>
-          <w:b/>
-          <w:bCs/>
-          <w:color w:val="1F1F1F"/>
-          <w:sz w:val="24"/>
-          <w:szCs w:val="24"/>
-          <w:lang w:bidi="ar-SA"/>
-        </w:rPr>
-      </w:pPr>
-      <w:r>
-        <w:rPr>
-          <w:rFonts w:ascii="Times New Roman" w:eastAsia="Times New Roman" w:hAnsi="Times New Roman" w:cs="Times New Roman"/>
-          <w:b/>
-          <w:bCs/>
-          <w:color w:val="1F1F1F"/>
+          <w:rFonts w:asciiTheme="majorBidi" w:eastAsia="Times New Roman" w:hAnsiTheme="majorBidi" w:cstheme="majorBidi"/>
+          <w:b/>
+          <w:bCs/>
+          <w:sz w:val="24"/>
+          <w:szCs w:val="24"/>
+          <w:lang w:bidi="ar-SA"/>
+        </w:rPr>
+      </w:pPr>
+      <w:r>
+        <w:rPr>
+          <w:rFonts w:asciiTheme="majorBidi" w:eastAsia="Times New Roman" w:hAnsiTheme="majorBidi" w:cstheme="majorBidi"/>
+          <w:b/>
+          <w:bCs/>
           <w:sz w:val="24"/>
           <w:szCs w:val="24"/>
           <w:lang w:bidi="ar-SA"/>
@@ -1490,19 +1450,17 @@
       <w:pPr>
         <w:spacing w:before="100" w:beforeAutospacing="1" w:after="0" w:line="240" w:lineRule="auto"/>
         <w:rPr>
-          <w:rFonts w:ascii="Times New Roman" w:eastAsia="Times New Roman" w:hAnsi="Times New Roman" w:cs="Times New Roman"/>
-          <w:color w:val="1F1F1F"/>
-          <w:sz w:val="24"/>
-          <w:szCs w:val="24"/>
-          <w:lang w:bidi="ar-SA"/>
-        </w:rPr>
-      </w:pPr>
-      <w:r>
-        <w:rPr>
-          <w:rFonts w:ascii="Times New Roman" w:eastAsia="Times New Roman" w:hAnsi="Times New Roman" w:cs="Times New Roman"/>
-          <w:b/>
-          <w:bCs/>
-          <w:color w:val="1F1F1F"/>
+          <w:rFonts w:asciiTheme="majorBidi" w:eastAsia="Times New Roman" w:hAnsiTheme="majorBidi" w:cstheme="majorBidi"/>
+          <w:sz w:val="24"/>
+          <w:szCs w:val="24"/>
+          <w:lang w:bidi="ar-SA"/>
+        </w:rPr>
+      </w:pPr>
+      <w:r>
+        <w:rPr>
+          <w:rFonts w:asciiTheme="majorBidi" w:eastAsia="Times New Roman" w:hAnsiTheme="majorBidi" w:cstheme="majorBidi"/>
+          <w:b/>
+          <w:bCs/>
           <w:sz w:val="24"/>
           <w:szCs w:val="24"/>
           <w:bdr w:val="none" w:sz="0" w:space="0" w:color="auto" w:frame="1"/>
@@ -1512,8 +1470,7 @@
       </w:r>
       <w:r>
         <w:rPr>
-          <w:rFonts w:ascii="Times New Roman" w:eastAsia="Times New Roman" w:hAnsi="Times New Roman" w:cs="Times New Roman"/>
-          <w:color w:val="1F1F1F"/>
+          <w:rFonts w:asciiTheme="majorBidi" w:eastAsia="Times New Roman" w:hAnsiTheme="majorBidi" w:cstheme="majorBidi"/>
           <w:sz w:val="24"/>
           <w:szCs w:val="24"/>
           <w:bdr w:val="none" w:sz="0" w:space="0" w:color="auto" w:frame="1"/>
@@ -1523,10 +1480,9 @@
       </w:r>
       <w:r>
         <w:rPr>
-          <w:rFonts w:ascii="Times New Roman" w:eastAsia="Times New Roman" w:hAnsi="Times New Roman" w:cs="Times New Roman"/>
+          <w:rFonts w:asciiTheme="majorBidi" w:eastAsia="Times New Roman" w:hAnsiTheme="majorBidi" w:cstheme="majorBidi"/>
           <w:i/>
           <w:iCs/>
-          <w:color w:val="1F1F1F"/>
           <w:sz w:val="24"/>
           <w:szCs w:val="24"/>
           <w:bdr w:val="none" w:sz="0" w:space="0" w:color="auto" w:frame="1"/>
@@ -1536,8 +1492,7 @@
       </w:r>
       <w:r>
         <w:rPr>
-          <w:rFonts w:ascii="Times New Roman" w:eastAsia="Times New Roman" w:hAnsi="Times New Roman" w:cs="Times New Roman"/>
-          <w:color w:val="1F1F1F"/>
+          <w:rFonts w:asciiTheme="majorBidi" w:eastAsia="Times New Roman" w:hAnsiTheme="majorBidi" w:cstheme="majorBidi"/>
           <w:sz w:val="24"/>
           <w:szCs w:val="24"/>
           <w:bdr w:val="none" w:sz="0" w:space="0" w:color="auto" w:frame="1"/>
@@ -1547,10 +1502,9 @@
       </w:r>
       <w:r>
         <w:rPr>
-          <w:rFonts w:ascii="Times New Roman" w:eastAsia="Times New Roman" w:hAnsi="Times New Roman" w:cs="Times New Roman"/>
-          <w:b/>
-          <w:bCs/>
-          <w:color w:val="1F1F1F"/>
+          <w:rFonts w:asciiTheme="majorBidi" w:eastAsia="Times New Roman" w:hAnsiTheme="majorBidi" w:cstheme="majorBidi"/>
+          <w:b/>
+          <w:bCs/>
           <w:sz w:val="24"/>
           <w:szCs w:val="24"/>
           <w:bdr w:val="none" w:sz="0" w:space="0" w:color="auto" w:frame="1"/>
@@ -1560,8 +1514,7 @@
       </w:r>
       <w:r>
         <w:rPr>
-          <w:rFonts w:ascii="Times New Roman" w:eastAsia="Times New Roman" w:hAnsi="Times New Roman" w:cs="Times New Roman"/>
-          <w:color w:val="1F1F1F"/>
+          <w:rFonts w:asciiTheme="majorBidi" w:eastAsia="Times New Roman" w:hAnsiTheme="majorBidi" w:cstheme="majorBidi"/>
           <w:sz w:val="24"/>
           <w:szCs w:val="24"/>
           <w:bdr w:val="none" w:sz="0" w:space="0" w:color="auto" w:frame="1"/>
@@ -1571,8 +1524,7 @@
       </w:r>
       <w:r>
         <w:rPr>
-          <w:rFonts w:ascii="Times New Roman" w:eastAsia="Times New Roman" w:hAnsi="Times New Roman" w:cs="Times New Roman"/>
-          <w:color w:val="1F1F1F"/>
+          <w:rFonts w:asciiTheme="majorBidi" w:eastAsia="Times New Roman" w:hAnsiTheme="majorBidi" w:cstheme="majorBidi"/>
           <w:sz w:val="24"/>
           <w:szCs w:val="24"/>
           <w:lang w:bidi="ar-SA"/>
@@ -1588,19 +1540,17 @@
         </w:numPr>
         <w:spacing w:before="100" w:beforeAutospacing="1" w:after="0" w:line="240" w:lineRule="auto"/>
         <w:rPr>
-          <w:rFonts w:ascii="Times New Roman" w:eastAsia="Times New Roman" w:hAnsi="Times New Roman" w:cs="Times New Roman"/>
-          <w:color w:val="1F1F1F"/>
-          <w:sz w:val="24"/>
-          <w:szCs w:val="24"/>
-          <w:lang w:bidi="ar-SA"/>
-        </w:rPr>
-      </w:pPr>
-      <w:r>
-        <w:rPr>
-          <w:rFonts w:ascii="Times New Roman" w:eastAsia="Times New Roman" w:hAnsi="Times New Roman" w:cs="Times New Roman"/>
-          <w:b/>
-          <w:bCs/>
-          <w:color w:val="1F1F1F"/>
+          <w:rFonts w:asciiTheme="majorBidi" w:eastAsia="Times New Roman" w:hAnsiTheme="majorBidi" w:cstheme="majorBidi"/>
+          <w:sz w:val="24"/>
+          <w:szCs w:val="24"/>
+          <w:lang w:bidi="ar-SA"/>
+        </w:rPr>
+      </w:pPr>
+      <w:r>
+        <w:rPr>
+          <w:rFonts w:asciiTheme="majorBidi" w:eastAsia="Times New Roman" w:hAnsiTheme="majorBidi" w:cstheme="majorBidi"/>
+          <w:b/>
+          <w:bCs/>
           <w:sz w:val="24"/>
           <w:szCs w:val="24"/>
           <w:bdr w:val="none" w:sz="0" w:space="0" w:color="auto" w:frame="1"/>
@@ -1610,8 +1560,7 @@
       </w:r>
       <w:r>
         <w:rPr>
-          <w:rFonts w:ascii="Times New Roman" w:eastAsia="Times New Roman" w:hAnsi="Times New Roman" w:cs="Times New Roman"/>
-          <w:color w:val="1F1F1F"/>
+          <w:rFonts w:asciiTheme="majorBidi" w:eastAsia="Times New Roman" w:hAnsiTheme="majorBidi" w:cstheme="majorBidi"/>
           <w:sz w:val="24"/>
           <w:szCs w:val="24"/>
           <w:bdr w:val="none" w:sz="0" w:space="0" w:color="auto" w:frame="1"/>
@@ -1621,8 +1570,7 @@
       </w:r>
       <w:r>
         <w:rPr>
-          <w:rFonts w:ascii="Times New Roman" w:eastAsia="Times New Roman" w:hAnsi="Times New Roman" w:cs="Times New Roman"/>
-          <w:color w:val="1F1F1F"/>
+          <w:rFonts w:asciiTheme="majorBidi" w:eastAsia="Times New Roman" w:hAnsiTheme="majorBidi" w:cstheme="majorBidi"/>
           <w:sz w:val="24"/>
           <w:szCs w:val="24"/>
           <w:lang w:bidi="ar-SA"/>
@@ -1638,19 +1586,17 @@
         </w:numPr>
         <w:spacing w:before="100" w:beforeAutospacing="1" w:after="0" w:line="240" w:lineRule="auto"/>
         <w:rPr>
-          <w:rFonts w:ascii="Times New Roman" w:eastAsia="Times New Roman" w:hAnsi="Times New Roman" w:cs="Times New Roman"/>
-          <w:color w:val="1F1F1F"/>
-          <w:sz w:val="24"/>
-          <w:szCs w:val="24"/>
-          <w:lang w:bidi="ar-SA"/>
-        </w:rPr>
-      </w:pPr>
-      <w:r>
-        <w:rPr>
-          <w:rFonts w:ascii="Times New Roman" w:eastAsia="Times New Roman" w:hAnsi="Times New Roman" w:cs="Times New Roman"/>
-          <w:b/>
-          <w:bCs/>
-          <w:color w:val="1F1F1F"/>
+          <w:rFonts w:asciiTheme="majorBidi" w:eastAsia="Times New Roman" w:hAnsiTheme="majorBidi" w:cstheme="majorBidi"/>
+          <w:sz w:val="24"/>
+          <w:szCs w:val="24"/>
+          <w:lang w:bidi="ar-SA"/>
+        </w:rPr>
+      </w:pPr>
+      <w:r>
+        <w:rPr>
+          <w:rFonts w:asciiTheme="majorBidi" w:eastAsia="Times New Roman" w:hAnsiTheme="majorBidi" w:cstheme="majorBidi"/>
+          <w:b/>
+          <w:bCs/>
           <w:sz w:val="24"/>
           <w:szCs w:val="24"/>
           <w:bdr w:val="none" w:sz="0" w:space="0" w:color="auto" w:frame="1"/>
@@ -1660,8 +1606,7 @@
       </w:r>
       <w:r>
         <w:rPr>
-          <w:rFonts w:ascii="Times New Roman" w:eastAsia="Times New Roman" w:hAnsi="Times New Roman" w:cs="Times New Roman"/>
-          <w:color w:val="1F1F1F"/>
+          <w:rFonts w:asciiTheme="majorBidi" w:eastAsia="Times New Roman" w:hAnsiTheme="majorBidi" w:cstheme="majorBidi"/>
           <w:sz w:val="24"/>
           <w:szCs w:val="24"/>
           <w:bdr w:val="none" w:sz="0" w:space="0" w:color="auto" w:frame="1"/>
@@ -1671,10 +1616,9 @@
       </w:r>
       <w:r>
         <w:rPr>
-          <w:rFonts w:ascii="Times New Roman" w:eastAsia="Times New Roman" w:hAnsi="Times New Roman" w:cs="Times New Roman"/>
-          <w:b/>
-          <w:bCs/>
-          <w:color w:val="1F1F1F"/>
+          <w:rFonts w:asciiTheme="majorBidi" w:eastAsia="Times New Roman" w:hAnsiTheme="majorBidi" w:cstheme="majorBidi"/>
+          <w:b/>
+          <w:bCs/>
           <w:sz w:val="24"/>
           <w:szCs w:val="24"/>
           <w:bdr w:val="none" w:sz="0" w:space="0" w:color="auto" w:frame="1"/>
@@ -1684,8 +1628,7 @@
       </w:r>
       <w:r>
         <w:rPr>
-          <w:rFonts w:ascii="Times New Roman" w:eastAsia="Times New Roman" w:hAnsi="Times New Roman" w:cs="Times New Roman"/>
-          <w:color w:val="1F1F1F"/>
+          <w:rFonts w:asciiTheme="majorBidi" w:eastAsia="Times New Roman" w:hAnsiTheme="majorBidi" w:cstheme="majorBidi"/>
           <w:sz w:val="24"/>
           <w:szCs w:val="24"/>
           <w:bdr w:val="none" w:sz="0" w:space="0" w:color="auto" w:frame="1"/>
@@ -1695,10 +1638,9 @@
       </w:r>
       <w:r>
         <w:rPr>
-          <w:rFonts w:ascii="Times New Roman" w:eastAsia="Times New Roman" w:hAnsi="Times New Roman" w:cs="Times New Roman"/>
-          <w:b/>
-          <w:bCs/>
-          <w:color w:val="1F1F1F"/>
+          <w:rFonts w:asciiTheme="majorBidi" w:eastAsia="Times New Roman" w:hAnsiTheme="majorBidi" w:cstheme="majorBidi"/>
+          <w:b/>
+          <w:bCs/>
           <w:sz w:val="24"/>
           <w:szCs w:val="24"/>
           <w:bdr w:val="none" w:sz="0" w:space="0" w:color="auto" w:frame="1"/>
@@ -1708,8 +1650,7 @@
       </w:r>
       <w:r>
         <w:rPr>
-          <w:rFonts w:ascii="Times New Roman" w:eastAsia="Times New Roman" w:hAnsi="Times New Roman" w:cs="Times New Roman"/>
-          <w:color w:val="1F1F1F"/>
+          <w:rFonts w:asciiTheme="majorBidi" w:eastAsia="Times New Roman" w:hAnsiTheme="majorBidi" w:cstheme="majorBidi"/>
           <w:sz w:val="24"/>
           <w:szCs w:val="24"/>
           <w:bdr w:val="none" w:sz="0" w:space="0" w:color="auto" w:frame="1"/>
@@ -1719,8 +1660,7 @@
       </w:r>
       <w:r>
         <w:rPr>
-          <w:rFonts w:ascii="Times New Roman" w:eastAsia="Times New Roman" w:hAnsi="Times New Roman" w:cs="Times New Roman"/>
-          <w:color w:val="1F1F1F"/>
+          <w:rFonts w:asciiTheme="majorBidi" w:eastAsia="Times New Roman" w:hAnsiTheme="majorBidi" w:cstheme="majorBidi"/>
           <w:sz w:val="24"/>
           <w:szCs w:val="24"/>
           <w:lang w:bidi="ar-SA"/>
@@ -1732,17 +1672,15 @@
       <w:pPr>
         <w:spacing w:before="100" w:beforeAutospacing="1" w:after="0" w:line="240" w:lineRule="auto"/>
         <w:rPr>
-          <w:rFonts w:ascii="Times New Roman" w:eastAsia="Times New Roman" w:hAnsi="Times New Roman" w:cs="Times New Roman"/>
-          <w:color w:val="1F1F1F"/>
-          <w:sz w:val="24"/>
-          <w:szCs w:val="24"/>
-          <w:lang w:bidi="ar-SA"/>
-        </w:rPr>
-      </w:pPr>
-      <w:r>
-        <w:rPr>
-          <w:rFonts w:ascii="Times New Roman" w:eastAsia="Times New Roman" w:hAnsi="Times New Roman" w:cs="Times New Roman"/>
-          <w:color w:val="1F1F1F"/>
+          <w:rFonts w:asciiTheme="majorBidi" w:eastAsia="Times New Roman" w:hAnsiTheme="majorBidi" w:cstheme="majorBidi"/>
+          <w:sz w:val="24"/>
+          <w:szCs w:val="24"/>
+          <w:lang w:bidi="ar-SA"/>
+        </w:rPr>
+      </w:pPr>
+      <w:r>
+        <w:rPr>
+          <w:rFonts w:asciiTheme="majorBidi" w:eastAsia="Times New Roman" w:hAnsiTheme="majorBidi" w:cstheme="majorBidi"/>
           <w:sz w:val="24"/>
           <w:szCs w:val="24"/>
           <w:bdr w:val="none" w:sz="0" w:space="0" w:color="auto" w:frame="1"/>
@@ -1759,19 +1697,17 @@
         </w:numPr>
         <w:spacing w:before="100" w:beforeAutospacing="1" w:after="0" w:line="240" w:lineRule="auto"/>
         <w:rPr>
-          <w:rFonts w:ascii="Times New Roman" w:eastAsia="Times New Roman" w:hAnsi="Times New Roman" w:cs="Times New Roman"/>
-          <w:color w:val="1F1F1F"/>
-          <w:sz w:val="24"/>
-          <w:szCs w:val="24"/>
-          <w:lang w:bidi="ar-SA"/>
-        </w:rPr>
-      </w:pPr>
-      <w:r>
-        <w:rPr>
-          <w:rFonts w:ascii="Times New Roman" w:eastAsia="Times New Roman" w:hAnsi="Times New Roman" w:cs="Times New Roman"/>
-          <w:b/>
-          <w:bCs/>
-          <w:color w:val="1F1F1F"/>
+          <w:rFonts w:asciiTheme="majorBidi" w:eastAsia="Times New Roman" w:hAnsiTheme="majorBidi" w:cstheme="majorBidi"/>
+          <w:sz w:val="24"/>
+          <w:szCs w:val="24"/>
+          <w:lang w:bidi="ar-SA"/>
+        </w:rPr>
+      </w:pPr>
+      <w:r>
+        <w:rPr>
+          <w:rFonts w:asciiTheme="majorBidi" w:eastAsia="Times New Roman" w:hAnsiTheme="majorBidi" w:cstheme="majorBidi"/>
+          <w:b/>
+          <w:bCs/>
           <w:sz w:val="24"/>
           <w:szCs w:val="24"/>
           <w:bdr w:val="none" w:sz="0" w:space="0" w:color="auto" w:frame="1"/>
@@ -1781,8 +1717,7 @@
       </w:r>
       <w:r>
         <w:rPr>
-          <w:rFonts w:ascii="Times New Roman" w:eastAsia="Times New Roman" w:hAnsi="Times New Roman" w:cs="Times New Roman"/>
-          <w:color w:val="1F1F1F"/>
+          <w:rFonts w:asciiTheme="majorBidi" w:eastAsia="Times New Roman" w:hAnsiTheme="majorBidi" w:cstheme="majorBidi"/>
           <w:sz w:val="24"/>
           <w:szCs w:val="24"/>
           <w:bdr w:val="none" w:sz="0" w:space="0" w:color="auto" w:frame="1"/>
@@ -1792,8 +1727,7 @@
       </w:r>
       <w:r>
         <w:rPr>
-          <w:rFonts w:ascii="Times New Roman" w:eastAsia="Times New Roman" w:hAnsi="Times New Roman" w:cs="Times New Roman"/>
-          <w:color w:val="1F1F1F"/>
+          <w:rFonts w:asciiTheme="majorBidi" w:eastAsia="Times New Roman" w:hAnsiTheme="majorBidi" w:cstheme="majorBidi"/>
           <w:sz w:val="24"/>
           <w:szCs w:val="24"/>
           <w:lang w:bidi="ar-SA"/>
@@ -1809,19 +1743,17 @@
         </w:numPr>
         <w:spacing w:before="100" w:beforeAutospacing="1" w:after="0" w:line="240" w:lineRule="auto"/>
         <w:rPr>
-          <w:rFonts w:ascii="Times New Roman" w:eastAsia="Times New Roman" w:hAnsi="Times New Roman" w:cs="Times New Roman"/>
-          <w:color w:val="1F1F1F"/>
-          <w:sz w:val="24"/>
-          <w:szCs w:val="24"/>
-          <w:lang w:bidi="ar-SA"/>
-        </w:rPr>
-      </w:pPr>
-      <w:r>
-        <w:rPr>
-          <w:rFonts w:ascii="Times New Roman" w:eastAsia="Times New Roman" w:hAnsi="Times New Roman" w:cs="Times New Roman"/>
-          <w:b/>
-          <w:bCs/>
-          <w:color w:val="1F1F1F"/>
+          <w:rFonts w:asciiTheme="majorBidi" w:eastAsia="Times New Roman" w:hAnsiTheme="majorBidi" w:cstheme="majorBidi"/>
+          <w:sz w:val="24"/>
+          <w:szCs w:val="24"/>
+          <w:lang w:bidi="ar-SA"/>
+        </w:rPr>
+      </w:pPr>
+      <w:r>
+        <w:rPr>
+          <w:rFonts w:asciiTheme="majorBidi" w:eastAsia="Times New Roman" w:hAnsiTheme="majorBidi" w:cstheme="majorBidi"/>
+          <w:b/>
+          <w:bCs/>
           <w:sz w:val="24"/>
           <w:szCs w:val="24"/>
           <w:bdr w:val="none" w:sz="0" w:space="0" w:color="auto" w:frame="1"/>
@@ -1831,8 +1763,7 @@
       </w:r>
       <w:r>
         <w:rPr>
-          <w:rFonts w:ascii="Times New Roman" w:eastAsia="Times New Roman" w:hAnsi="Times New Roman" w:cs="Times New Roman"/>
-          <w:color w:val="1F1F1F"/>
+          <w:rFonts w:asciiTheme="majorBidi" w:eastAsia="Times New Roman" w:hAnsiTheme="majorBidi" w:cstheme="majorBidi"/>
           <w:sz w:val="24"/>
           <w:szCs w:val="24"/>
           <w:bdr w:val="none" w:sz="0" w:space="0" w:color="auto" w:frame="1"/>
@@ -1842,8 +1773,7 @@
       </w:r>
       <w:r>
         <w:rPr>
-          <w:rFonts w:ascii="Times New Roman" w:eastAsia="Times New Roman" w:hAnsi="Times New Roman" w:cs="Times New Roman"/>
-          <w:color w:val="1F1F1F"/>
+          <w:rFonts w:asciiTheme="majorBidi" w:eastAsia="Times New Roman" w:hAnsiTheme="majorBidi" w:cstheme="majorBidi"/>
           <w:sz w:val="24"/>
           <w:szCs w:val="24"/>
           <w:lang w:bidi="ar-SA"/>
@@ -1859,19 +1789,17 @@
         </w:numPr>
         <w:spacing w:before="100" w:beforeAutospacing="1" w:after="0" w:line="240" w:lineRule="auto"/>
         <w:rPr>
-          <w:rFonts w:ascii="Times New Roman" w:eastAsia="Times New Roman" w:hAnsi="Times New Roman" w:cs="Times New Roman"/>
-          <w:color w:val="1F1F1F"/>
-          <w:sz w:val="24"/>
-          <w:szCs w:val="24"/>
-          <w:lang w:bidi="ar-SA"/>
-        </w:rPr>
-      </w:pPr>
-      <w:r>
-        <w:rPr>
-          <w:rFonts w:ascii="Times New Roman" w:eastAsia="Times New Roman" w:hAnsi="Times New Roman" w:cs="Times New Roman"/>
-          <w:b/>
-          <w:bCs/>
-          <w:color w:val="1F1F1F"/>
+          <w:rFonts w:asciiTheme="majorBidi" w:eastAsia="Times New Roman" w:hAnsiTheme="majorBidi" w:cstheme="majorBidi"/>
+          <w:sz w:val="24"/>
+          <w:szCs w:val="24"/>
+          <w:lang w:bidi="ar-SA"/>
+        </w:rPr>
+      </w:pPr>
+      <w:r>
+        <w:rPr>
+          <w:rFonts w:asciiTheme="majorBidi" w:eastAsia="Times New Roman" w:hAnsiTheme="majorBidi" w:cstheme="majorBidi"/>
+          <w:b/>
+          <w:bCs/>
           <w:sz w:val="24"/>
           <w:szCs w:val="24"/>
           <w:bdr w:val="none" w:sz="0" w:space="0" w:color="auto" w:frame="1"/>
@@ -1881,8 +1809,7 @@
       </w:r>
       <w:r>
         <w:rPr>
-          <w:rFonts w:ascii="Times New Roman" w:eastAsia="Times New Roman" w:hAnsi="Times New Roman" w:cs="Times New Roman"/>
-          <w:color w:val="1F1F1F"/>
+          <w:rFonts w:asciiTheme="majorBidi" w:eastAsia="Times New Roman" w:hAnsiTheme="majorBidi" w:cstheme="majorBidi"/>
           <w:sz w:val="24"/>
           <w:szCs w:val="24"/>
           <w:bdr w:val="none" w:sz="0" w:space="0" w:color="auto" w:frame="1"/>
@@ -1892,8 +1819,7 @@
       </w:r>
       <w:r>
         <w:rPr>
-          <w:rFonts w:ascii="Times New Roman" w:eastAsia="Times New Roman" w:hAnsi="Times New Roman" w:cs="Times New Roman"/>
-          <w:color w:val="1F1F1F"/>
+          <w:rFonts w:asciiTheme="majorBidi" w:eastAsia="Times New Roman" w:hAnsiTheme="majorBidi" w:cstheme="majorBidi"/>
           <w:sz w:val="24"/>
           <w:szCs w:val="24"/>
           <w:lang w:bidi="ar-SA"/>
@@ -1905,17 +1831,15 @@
       <w:pPr>
         <w:spacing w:before="100" w:beforeAutospacing="1" w:after="0" w:line="240" w:lineRule="auto"/>
         <w:rPr>
-          <w:rFonts w:ascii="Times New Roman" w:eastAsia="Times New Roman" w:hAnsi="Times New Roman" w:cs="Times New Roman"/>
-          <w:color w:val="1F1F1F"/>
-          <w:sz w:val="24"/>
-          <w:szCs w:val="24"/>
-          <w:lang w:bidi="ar-SA"/>
-        </w:rPr>
-      </w:pPr>
-      <w:r>
-        <w:rPr>
-          <w:rFonts w:ascii="Times New Roman" w:eastAsia="Times New Roman" w:hAnsi="Times New Roman" w:cs="Times New Roman"/>
-          <w:color w:val="1F1F1F"/>
+          <w:rFonts w:asciiTheme="majorBidi" w:eastAsia="Times New Roman" w:hAnsiTheme="majorBidi" w:cstheme="majorBidi"/>
+          <w:sz w:val="24"/>
+          <w:szCs w:val="24"/>
+          <w:lang w:bidi="ar-SA"/>
+        </w:rPr>
+      </w:pPr>
+      <w:r>
+        <w:rPr>
+          <w:rFonts w:asciiTheme="majorBidi" w:eastAsia="Times New Roman" w:hAnsiTheme="majorBidi" w:cstheme="majorBidi"/>
           <w:sz w:val="24"/>
           <w:szCs w:val="24"/>
           <w:bdr w:val="none" w:sz="0" w:space="0" w:color="auto" w:frame="1"/>
@@ -1932,30 +1856,28 @@
         </w:numPr>
         <w:spacing w:before="100" w:beforeAutospacing="1" w:after="0" w:line="240" w:lineRule="auto"/>
         <w:rPr>
-          <w:rFonts w:ascii="Times New Roman" w:eastAsia="Times New Roman" w:hAnsi="Times New Roman" w:cs="Times New Roman"/>
-          <w:color w:val="1F1F1F"/>
-          <w:sz w:val="24"/>
-          <w:szCs w:val="24"/>
-          <w:lang w:bidi="ar-SA"/>
-        </w:rPr>
-      </w:pPr>
-      <w:r>
-        <w:rPr>
-          <w:rFonts w:ascii="Times New Roman" w:eastAsia="Times New Roman" w:hAnsi="Times New Roman" w:cs="Times New Roman"/>
-          <w:color w:val="1F1F1F"/>
-          <w:sz w:val="24"/>
-          <w:szCs w:val="24"/>
-          <w:bdr w:val="none" w:sz="0" w:space="0" w:color="auto" w:frame="1"/>
-          <w:lang w:bidi="ar-SA"/>
-        </w:rPr>
+          <w:rFonts w:asciiTheme="majorBidi" w:eastAsia="Times New Roman" w:hAnsiTheme="majorBidi" w:cstheme="majorBidi"/>
+          <w:sz w:val="24"/>
+          <w:szCs w:val="24"/>
+          <w:lang w:bidi="ar-SA"/>
+        </w:rPr>
+      </w:pPr>
+      <w:r>
+        <w:rPr>
+          <w:rFonts w:asciiTheme="majorBidi" w:eastAsia="Times New Roman" w:hAnsiTheme="majorBidi" w:cstheme="majorBidi"/>
+          <w:sz w:val="24"/>
+          <w:szCs w:val="24"/>
+          <w:bdr w:val="none" w:sz="0" w:space="0" w:color="auto" w:frame="1"/>
+          <w:lang w:bidi="ar-SA"/>
+        </w:rPr>
+        <w:lastRenderedPageBreak/>
         <w:t xml:space="preserve">For </w:t>
       </w:r>
       <w:r>
         <w:rPr>
-          <w:rFonts w:ascii="Times New Roman" w:eastAsia="Times New Roman" w:hAnsi="Times New Roman" w:cs="Times New Roman"/>
-          <w:b/>
-          <w:bCs/>
-          <w:color w:val="1F1F1F"/>
+          <w:rFonts w:asciiTheme="majorBidi" w:eastAsia="Times New Roman" w:hAnsiTheme="majorBidi" w:cstheme="majorBidi"/>
+          <w:b/>
+          <w:bCs/>
           <w:sz w:val="24"/>
           <w:szCs w:val="24"/>
           <w:bdr w:val="none" w:sz="0" w:space="0" w:color="auto" w:frame="1"/>
@@ -1965,8 +1887,7 @@
       </w:r>
       <w:r>
         <w:rPr>
-          <w:rFonts w:ascii="Times New Roman" w:eastAsia="Times New Roman" w:hAnsi="Times New Roman" w:cs="Times New Roman"/>
-          <w:color w:val="1F1F1F"/>
+          <w:rFonts w:asciiTheme="majorBidi" w:eastAsia="Times New Roman" w:hAnsiTheme="majorBidi" w:cstheme="majorBidi"/>
           <w:sz w:val="24"/>
           <w:szCs w:val="24"/>
           <w:bdr w:val="none" w:sz="0" w:space="0" w:color="auto" w:frame="1"/>
@@ -1976,8 +1897,7 @@
       </w:r>
       <w:r>
         <w:rPr>
-          <w:rFonts w:ascii="Times New Roman" w:eastAsia="Times New Roman" w:hAnsi="Times New Roman" w:cs="Times New Roman"/>
-          <w:color w:val="1F1F1F"/>
+          <w:rFonts w:asciiTheme="majorBidi" w:eastAsia="Times New Roman" w:hAnsiTheme="majorBidi" w:cstheme="majorBidi"/>
           <w:sz w:val="24"/>
           <w:szCs w:val="24"/>
           <w:lang w:bidi="ar-SA"/>
@@ -1993,31 +1913,27 @@
         </w:numPr>
         <w:spacing w:before="100" w:beforeAutospacing="1" w:after="0" w:line="240" w:lineRule="auto"/>
         <w:rPr>
-          <w:rFonts w:ascii="Times New Roman" w:eastAsia="Times New Roman" w:hAnsi="Times New Roman" w:cs="Times New Roman"/>
-          <w:color w:val="1F1F1F"/>
-          <w:sz w:val="24"/>
-          <w:szCs w:val="24"/>
-          <w:lang w:bidi="ar-SA"/>
-        </w:rPr>
-      </w:pPr>
-      <w:r>
-        <w:rPr>
-          <w:rFonts w:ascii="Times New Roman" w:eastAsia="Times New Roman" w:hAnsi="Times New Roman" w:cs="Times New Roman"/>
-          <w:color w:val="1F1F1F"/>
-          <w:sz w:val="24"/>
-          <w:szCs w:val="24"/>
-          <w:bdr w:val="none" w:sz="0" w:space="0" w:color="auto" w:frame="1"/>
-          <w:lang w:bidi="ar-SA"/>
-        </w:rPr>
-        <w:lastRenderedPageBreak/>
+          <w:rFonts w:asciiTheme="majorBidi" w:eastAsia="Times New Roman" w:hAnsiTheme="majorBidi" w:cstheme="majorBidi"/>
+          <w:sz w:val="24"/>
+          <w:szCs w:val="24"/>
+          <w:lang w:bidi="ar-SA"/>
+        </w:rPr>
+      </w:pPr>
+      <w:r>
+        <w:rPr>
+          <w:rFonts w:asciiTheme="majorBidi" w:eastAsia="Times New Roman" w:hAnsiTheme="majorBidi" w:cstheme="majorBidi"/>
+          <w:sz w:val="24"/>
+          <w:szCs w:val="24"/>
+          <w:bdr w:val="none" w:sz="0" w:space="0" w:color="auto" w:frame="1"/>
+          <w:lang w:bidi="ar-SA"/>
+        </w:rPr>
         <w:t xml:space="preserve">When a company wants to achieve </w:t>
       </w:r>
       <w:r>
         <w:rPr>
-          <w:rFonts w:ascii="Times New Roman" w:eastAsia="Times New Roman" w:hAnsi="Times New Roman" w:cs="Times New Roman"/>
-          <w:b/>
-          <w:bCs/>
-          <w:color w:val="1F1F1F"/>
+          <w:rFonts w:asciiTheme="majorBidi" w:eastAsia="Times New Roman" w:hAnsiTheme="majorBidi" w:cstheme="majorBidi"/>
+          <w:b/>
+          <w:bCs/>
           <w:sz w:val="24"/>
           <w:szCs w:val="24"/>
           <w:bdr w:val="none" w:sz="0" w:space="0" w:color="auto" w:frame="1"/>
@@ -2027,8 +1943,7 @@
       </w:r>
       <w:r>
         <w:rPr>
-          <w:rFonts w:ascii="Times New Roman" w:eastAsia="Times New Roman" w:hAnsi="Times New Roman" w:cs="Times New Roman"/>
-          <w:color w:val="1F1F1F"/>
+          <w:rFonts w:asciiTheme="majorBidi" w:eastAsia="Times New Roman" w:hAnsiTheme="majorBidi" w:cstheme="majorBidi"/>
           <w:sz w:val="24"/>
           <w:szCs w:val="24"/>
           <w:bdr w:val="none" w:sz="0" w:space="0" w:color="auto" w:frame="1"/>
@@ -2038,8 +1953,7 @@
       </w:r>
       <w:r>
         <w:rPr>
-          <w:rFonts w:ascii="Times New Roman" w:eastAsia="Times New Roman" w:hAnsi="Times New Roman" w:cs="Times New Roman"/>
-          <w:color w:val="1F1F1F"/>
+          <w:rFonts w:asciiTheme="majorBidi" w:eastAsia="Times New Roman" w:hAnsiTheme="majorBidi" w:cstheme="majorBidi"/>
           <w:sz w:val="24"/>
           <w:szCs w:val="24"/>
           <w:lang w:bidi="ar-SA"/>
@@ -2055,17 +1969,15 @@
         </w:numPr>
         <w:spacing w:before="100" w:beforeAutospacing="1" w:after="0" w:line="240" w:lineRule="auto"/>
         <w:rPr>
-          <w:rFonts w:ascii="Times New Roman" w:eastAsia="Times New Roman" w:hAnsi="Times New Roman" w:cs="Times New Roman"/>
-          <w:color w:val="1F1F1F"/>
-          <w:sz w:val="24"/>
-          <w:szCs w:val="24"/>
-          <w:lang w:bidi="ar-SA"/>
-        </w:rPr>
-      </w:pPr>
-      <w:r>
-        <w:rPr>
-          <w:rFonts w:ascii="Times New Roman" w:eastAsia="Times New Roman" w:hAnsi="Times New Roman" w:cs="Times New Roman"/>
-          <w:color w:val="1F1F1F"/>
+          <w:rFonts w:asciiTheme="majorBidi" w:eastAsia="Times New Roman" w:hAnsiTheme="majorBidi" w:cstheme="majorBidi"/>
+          <w:sz w:val="24"/>
+          <w:szCs w:val="24"/>
+          <w:lang w:bidi="ar-SA"/>
+        </w:rPr>
+      </w:pPr>
+      <w:r>
+        <w:rPr>
+          <w:rFonts w:asciiTheme="majorBidi" w:eastAsia="Times New Roman" w:hAnsiTheme="majorBidi" w:cstheme="majorBidi"/>
           <w:sz w:val="24"/>
           <w:szCs w:val="24"/>
           <w:bdr w:val="none" w:sz="0" w:space="0" w:color="auto" w:frame="1"/>
@@ -2075,8 +1987,7 @@
       </w:r>
       <w:r>
         <w:rPr>
-          <w:rFonts w:ascii="Times New Roman" w:eastAsia="Times New Roman" w:hAnsi="Times New Roman" w:cs="Times New Roman"/>
-          <w:color w:val="1F1F1F"/>
+          <w:rFonts w:asciiTheme="majorBidi" w:eastAsia="Times New Roman" w:hAnsiTheme="majorBidi" w:cstheme="majorBidi"/>
           <w:sz w:val="24"/>
           <w:szCs w:val="24"/>
           <w:lang w:bidi="ar-SA"/>
@@ -2089,21 +2000,19 @@
         <w:spacing w:before="100" w:beforeAutospacing="1" w:after="0" w:line="240" w:lineRule="auto"/>
         <w:outlineLvl w:val="2"/>
         <w:rPr>
-          <w:rFonts w:ascii="Times New Roman" w:eastAsia="Times New Roman" w:hAnsi="Times New Roman" w:cs="Times New Roman"/>
-          <w:b/>
-          <w:bCs/>
-          <w:color w:val="1F1F1F"/>
-          <w:sz w:val="24"/>
-          <w:szCs w:val="24"/>
-          <w:lang w:bidi="ar-SA"/>
-        </w:rPr>
-      </w:pPr>
-      <w:r>
-        <w:rPr>
-          <w:rFonts w:ascii="Times New Roman" w:eastAsia="Times New Roman" w:hAnsi="Times New Roman" w:cs="Times New Roman"/>
-          <w:b/>
-          <w:bCs/>
-          <w:color w:val="1F1F1F"/>
+          <w:rFonts w:asciiTheme="majorBidi" w:eastAsia="Times New Roman" w:hAnsiTheme="majorBidi" w:cstheme="majorBidi"/>
+          <w:b/>
+          <w:bCs/>
+          <w:sz w:val="24"/>
+          <w:szCs w:val="24"/>
+          <w:lang w:bidi="ar-SA"/>
+        </w:rPr>
+      </w:pPr>
+      <w:r>
+        <w:rPr>
+          <w:rFonts w:asciiTheme="majorBidi" w:eastAsia="Times New Roman" w:hAnsiTheme="majorBidi" w:cstheme="majorBidi"/>
+          <w:b/>
+          <w:bCs/>
           <w:sz w:val="24"/>
           <w:szCs w:val="24"/>
           <w:lang w:bidi="ar-SA"/>
@@ -2119,19 +2028,17 @@
         </w:numPr>
         <w:spacing w:before="100" w:beforeAutospacing="1" w:after="0" w:line="240" w:lineRule="auto"/>
         <w:rPr>
-          <w:rFonts w:ascii="Times New Roman" w:eastAsia="Times New Roman" w:hAnsi="Times New Roman" w:cs="Times New Roman"/>
-          <w:color w:val="1F1F1F"/>
-          <w:sz w:val="24"/>
-          <w:szCs w:val="24"/>
-          <w:lang w:bidi="ar-SA"/>
-        </w:rPr>
-      </w:pPr>
-      <w:r>
-        <w:rPr>
-          <w:rFonts w:ascii="Times New Roman" w:eastAsia="Times New Roman" w:hAnsi="Times New Roman" w:cs="Times New Roman"/>
-          <w:b/>
-          <w:bCs/>
-          <w:color w:val="1F1F1F"/>
+          <w:rFonts w:asciiTheme="majorBidi" w:eastAsia="Times New Roman" w:hAnsiTheme="majorBidi" w:cstheme="majorBidi"/>
+          <w:sz w:val="24"/>
+          <w:szCs w:val="24"/>
+          <w:lang w:bidi="ar-SA"/>
+        </w:rPr>
+      </w:pPr>
+      <w:r>
+        <w:rPr>
+          <w:rFonts w:asciiTheme="majorBidi" w:eastAsia="Times New Roman" w:hAnsiTheme="majorBidi" w:cstheme="majorBidi"/>
+          <w:b/>
+          <w:bCs/>
           <w:sz w:val="24"/>
           <w:szCs w:val="24"/>
           <w:bdr w:val="none" w:sz="0" w:space="0" w:color="auto" w:frame="1"/>
@@ -2141,8 +2048,7 @@
       </w:r>
       <w:r>
         <w:rPr>
-          <w:rFonts w:ascii="Times New Roman" w:eastAsia="Times New Roman" w:hAnsi="Times New Roman" w:cs="Times New Roman"/>
-          <w:color w:val="1F1F1F"/>
+          <w:rFonts w:asciiTheme="majorBidi" w:eastAsia="Times New Roman" w:hAnsiTheme="majorBidi" w:cstheme="majorBidi"/>
           <w:sz w:val="24"/>
           <w:szCs w:val="24"/>
           <w:bdr w:val="none" w:sz="0" w:space="0" w:color="auto" w:frame="1"/>
@@ -2152,10 +2058,9 @@
       </w:r>
       <w:r>
         <w:rPr>
-          <w:rFonts w:ascii="Times New Roman" w:eastAsia="Times New Roman" w:hAnsi="Times New Roman" w:cs="Times New Roman"/>
+          <w:rFonts w:asciiTheme="majorBidi" w:eastAsia="Times New Roman" w:hAnsiTheme="majorBidi" w:cstheme="majorBidi"/>
           <w:i/>
           <w:iCs/>
-          <w:color w:val="1F1F1F"/>
           <w:sz w:val="24"/>
           <w:szCs w:val="24"/>
           <w:bdr w:val="none" w:sz="0" w:space="0" w:color="auto" w:frame="1"/>
@@ -2165,8 +2070,7 @@
       </w:r>
       <w:r>
         <w:rPr>
-          <w:rFonts w:ascii="Times New Roman" w:eastAsia="Times New Roman" w:hAnsi="Times New Roman" w:cs="Times New Roman"/>
-          <w:color w:val="1F1F1F"/>
+          <w:rFonts w:asciiTheme="majorBidi" w:eastAsia="Times New Roman" w:hAnsiTheme="majorBidi" w:cstheme="majorBidi"/>
           <w:sz w:val="24"/>
           <w:szCs w:val="24"/>
           <w:bdr w:val="none" w:sz="0" w:space="0" w:color="auto" w:frame="1"/>
@@ -2176,8 +2080,7 @@
       </w:r>
       <w:r>
         <w:rPr>
-          <w:rFonts w:ascii="Times New Roman" w:eastAsia="Times New Roman" w:hAnsi="Times New Roman" w:cs="Times New Roman"/>
-          <w:color w:val="1F1F1F"/>
+          <w:rFonts w:asciiTheme="majorBidi" w:eastAsia="Times New Roman" w:hAnsiTheme="majorBidi" w:cstheme="majorBidi"/>
           <w:sz w:val="24"/>
           <w:szCs w:val="24"/>
           <w:lang w:bidi="ar-SA"/>
@@ -2193,19 +2096,17 @@
         </w:numPr>
         <w:spacing w:before="100" w:beforeAutospacing="1" w:after="0" w:line="240" w:lineRule="auto"/>
         <w:rPr>
-          <w:rFonts w:ascii="Times New Roman" w:eastAsia="Times New Roman" w:hAnsi="Times New Roman" w:cs="Times New Roman"/>
-          <w:color w:val="1F1F1F"/>
-          <w:sz w:val="24"/>
-          <w:szCs w:val="24"/>
-          <w:lang w:bidi="ar-SA"/>
-        </w:rPr>
-      </w:pPr>
-      <w:r>
-        <w:rPr>
-          <w:rFonts w:ascii="Times New Roman" w:eastAsia="Times New Roman" w:hAnsi="Times New Roman" w:cs="Times New Roman"/>
-          <w:b/>
-          <w:bCs/>
-          <w:color w:val="1F1F1F"/>
+          <w:rFonts w:asciiTheme="majorBidi" w:eastAsia="Times New Roman" w:hAnsiTheme="majorBidi" w:cstheme="majorBidi"/>
+          <w:sz w:val="24"/>
+          <w:szCs w:val="24"/>
+          <w:lang w:bidi="ar-SA"/>
+        </w:rPr>
+      </w:pPr>
+      <w:r>
+        <w:rPr>
+          <w:rFonts w:asciiTheme="majorBidi" w:eastAsia="Times New Roman" w:hAnsiTheme="majorBidi" w:cstheme="majorBidi"/>
+          <w:b/>
+          <w:bCs/>
           <w:sz w:val="24"/>
           <w:szCs w:val="24"/>
           <w:bdr w:val="none" w:sz="0" w:space="0" w:color="auto" w:frame="1"/>
@@ -2215,8 +2116,7 @@
       </w:r>
       <w:r>
         <w:rPr>
-          <w:rFonts w:ascii="Times New Roman" w:eastAsia="Times New Roman" w:hAnsi="Times New Roman" w:cs="Times New Roman"/>
-          <w:color w:val="1F1F1F"/>
+          <w:rFonts w:asciiTheme="majorBidi" w:eastAsia="Times New Roman" w:hAnsiTheme="majorBidi" w:cstheme="majorBidi"/>
           <w:sz w:val="24"/>
           <w:szCs w:val="24"/>
           <w:bdr w:val="none" w:sz="0" w:space="0" w:color="auto" w:frame="1"/>
@@ -2226,10 +2126,9 @@
       </w:r>
       <w:r>
         <w:rPr>
-          <w:rFonts w:ascii="Times New Roman" w:eastAsia="Times New Roman" w:hAnsi="Times New Roman" w:cs="Times New Roman"/>
+          <w:rFonts w:asciiTheme="majorBidi" w:eastAsia="Times New Roman" w:hAnsiTheme="majorBidi" w:cstheme="majorBidi"/>
           <w:i/>
           <w:iCs/>
-          <w:color w:val="1F1F1F"/>
           <w:sz w:val="24"/>
           <w:szCs w:val="24"/>
           <w:bdr w:val="none" w:sz="0" w:space="0" w:color="auto" w:frame="1"/>
@@ -2239,8 +2138,7 @@
       </w:r>
       <w:r>
         <w:rPr>
-          <w:rFonts w:ascii="Times New Roman" w:eastAsia="Times New Roman" w:hAnsi="Times New Roman" w:cs="Times New Roman"/>
-          <w:color w:val="1F1F1F"/>
+          <w:rFonts w:asciiTheme="majorBidi" w:eastAsia="Times New Roman" w:hAnsiTheme="majorBidi" w:cstheme="majorBidi"/>
           <w:sz w:val="24"/>
           <w:szCs w:val="24"/>
           <w:bdr w:val="none" w:sz="0" w:space="0" w:color="auto" w:frame="1"/>
@@ -2250,8 +2148,7 @@
       </w:r>
       <w:r>
         <w:rPr>
-          <w:rFonts w:ascii="Times New Roman" w:eastAsia="Times New Roman" w:hAnsi="Times New Roman" w:cs="Times New Roman"/>
-          <w:color w:val="1F1F1F"/>
+          <w:rFonts w:asciiTheme="majorBidi" w:eastAsia="Times New Roman" w:hAnsiTheme="majorBidi" w:cstheme="majorBidi"/>
           <w:sz w:val="24"/>
           <w:szCs w:val="24"/>
           <w:lang w:bidi="ar-SA"/>
@@ -2267,19 +2164,17 @@
         </w:numPr>
         <w:spacing w:before="100" w:beforeAutospacing="1" w:after="0" w:line="240" w:lineRule="auto"/>
         <w:rPr>
-          <w:rFonts w:ascii="Times New Roman" w:eastAsia="Times New Roman" w:hAnsi="Times New Roman" w:cs="Times New Roman"/>
-          <w:color w:val="1F1F1F"/>
-          <w:sz w:val="24"/>
-          <w:szCs w:val="24"/>
-          <w:lang w:bidi="ar-SA"/>
-        </w:rPr>
-      </w:pPr>
-      <w:r>
-        <w:rPr>
-          <w:rFonts w:ascii="Times New Roman" w:eastAsia="Times New Roman" w:hAnsi="Times New Roman" w:cs="Times New Roman"/>
-          <w:b/>
-          <w:bCs/>
-          <w:color w:val="1F1F1F"/>
+          <w:rFonts w:asciiTheme="majorBidi" w:eastAsia="Times New Roman" w:hAnsiTheme="majorBidi" w:cstheme="majorBidi"/>
+          <w:sz w:val="24"/>
+          <w:szCs w:val="24"/>
+          <w:lang w:bidi="ar-SA"/>
+        </w:rPr>
+      </w:pPr>
+      <w:r>
+        <w:rPr>
+          <w:rFonts w:asciiTheme="majorBidi" w:eastAsia="Times New Roman" w:hAnsiTheme="majorBidi" w:cstheme="majorBidi"/>
+          <w:b/>
+          <w:bCs/>
           <w:sz w:val="24"/>
           <w:szCs w:val="24"/>
           <w:bdr w:val="none" w:sz="0" w:space="0" w:color="auto" w:frame="1"/>
@@ -2289,8 +2184,7 @@
       </w:r>
       <w:r>
         <w:rPr>
-          <w:rFonts w:ascii="Times New Roman" w:eastAsia="Times New Roman" w:hAnsi="Times New Roman" w:cs="Times New Roman"/>
-          <w:color w:val="1F1F1F"/>
+          <w:rFonts w:asciiTheme="majorBidi" w:eastAsia="Times New Roman" w:hAnsiTheme="majorBidi" w:cstheme="majorBidi"/>
           <w:sz w:val="24"/>
           <w:szCs w:val="24"/>
           <w:bdr w:val="none" w:sz="0" w:space="0" w:color="auto" w:frame="1"/>
@@ -2300,8 +2194,7 @@
       </w:r>
       <w:r>
         <w:rPr>
-          <w:rFonts w:ascii="Times New Roman" w:eastAsia="Times New Roman" w:hAnsi="Times New Roman" w:cs="Times New Roman"/>
-          <w:color w:val="1F1F1F"/>
+          <w:rFonts w:asciiTheme="majorBidi" w:eastAsia="Times New Roman" w:hAnsiTheme="majorBidi" w:cstheme="majorBidi"/>
           <w:sz w:val="24"/>
           <w:szCs w:val="24"/>
           <w:lang w:bidi="ar-SA"/>
@@ -2312,37 +2205,41 @@
     <w:p>
       <w:pPr>
         <w:rPr>
-          <w:sz w:val="24"/>
-          <w:szCs w:val="24"/>
-        </w:rPr>
-      </w:pPr>
-    </w:p>
-    <w:p>
-      <w:pPr>
-        <w:rPr>
-          <w:sz w:val="24"/>
-          <w:szCs w:val="24"/>
-        </w:rPr>
-      </w:pPr>
-    </w:p>
-    <w:p>
-      <w:pPr>
-        <w:rPr>
-          <w:sz w:val="24"/>
-          <w:szCs w:val="24"/>
-        </w:rPr>
-      </w:pPr>
-    </w:p>
-    <w:p>
-      <w:pPr>
-        <w:rPr>
-          <w:sz w:val="24"/>
-          <w:szCs w:val="24"/>
-        </w:rPr>
-      </w:pPr>
-      <w:r>
-        <w:rPr>
-          <w:rFonts w:ascii="Arial" w:eastAsia="Times New Roman" w:hAnsi="Arial" w:cs="Arial"/>
+          <w:rFonts w:asciiTheme="majorBidi" w:hAnsiTheme="majorBidi" w:cstheme="majorBidi"/>
+          <w:sz w:val="24"/>
+          <w:szCs w:val="24"/>
+        </w:rPr>
+      </w:pPr>
+    </w:p>
+    <w:p>
+      <w:pPr>
+        <w:rPr>
+          <w:rFonts w:asciiTheme="majorBidi" w:hAnsiTheme="majorBidi" w:cstheme="majorBidi"/>
+          <w:sz w:val="24"/>
+          <w:szCs w:val="24"/>
+        </w:rPr>
+      </w:pPr>
+    </w:p>
+    <w:p>
+      <w:pPr>
+        <w:rPr>
+          <w:rFonts w:asciiTheme="majorBidi" w:hAnsiTheme="majorBidi" w:cstheme="majorBidi"/>
+          <w:sz w:val="24"/>
+          <w:szCs w:val="24"/>
+        </w:rPr>
+      </w:pPr>
+    </w:p>
+    <w:p>
+      <w:pPr>
+        <w:rPr>
+          <w:rFonts w:asciiTheme="majorBidi" w:hAnsiTheme="majorBidi" w:cstheme="majorBidi"/>
+          <w:sz w:val="24"/>
+          <w:szCs w:val="24"/>
+        </w:rPr>
+      </w:pPr>
+      <w:r>
+        <w:rPr>
+          <w:rFonts w:asciiTheme="majorBidi" w:eastAsia="Times New Roman" w:hAnsiTheme="majorBidi" w:cstheme="majorBidi"/>
           <w:sz w:val="24"/>
           <w:szCs w:val="24"/>
           <w:lang w:bidi="ar-SA"/>
@@ -2353,12 +2250,14 @@
     <w:p>
       <w:pPr>
         <w:rPr>
-          <w:sz w:val="24"/>
-          <w:szCs w:val="24"/>
-        </w:rPr>
-      </w:pPr>
-      <w:r>
-        <w:rPr>
+          <w:rFonts w:asciiTheme="majorBidi" w:hAnsiTheme="majorBidi" w:cstheme="majorBidi"/>
+          <w:sz w:val="24"/>
+          <w:szCs w:val="24"/>
+        </w:rPr>
+      </w:pPr>
+      <w:r>
+        <w:rPr>
+          <w:rFonts w:asciiTheme="majorBidi" w:hAnsiTheme="majorBidi" w:cstheme="majorBidi"/>
           <w:sz w:val="24"/>
           <w:szCs w:val="24"/>
         </w:rPr>
@@ -2368,42 +2267,89 @@
     <w:p>
       <w:pPr>
         <w:pStyle w:val="Heading2"/>
-        <w:rPr>
-          <w:b/>
-          <w:bCs/>
-          <w:lang w:bidi="ar-SA"/>
-        </w:rPr>
-      </w:pPr>
-      <w:r>
-        <w:rPr>
-          <w:b/>
-          <w:bCs/>
+        <w:jc w:val="center"/>
+        <w:rPr>
+          <w:rFonts w:asciiTheme="majorBidi" w:hAnsiTheme="majorBidi"/>
+          <w:b/>
+          <w:bCs/>
+          <w:color w:val="auto"/>
+          <w:sz w:val="32"/>
+          <w:szCs w:val="32"/>
+        </w:rPr>
+      </w:pPr>
+      <w:r>
+        <w:rPr>
+          <w:rFonts w:asciiTheme="majorBidi" w:hAnsiTheme="majorBidi"/>
+          <w:b/>
+          <w:bCs/>
+          <w:color w:val="auto"/>
+          <w:sz w:val="32"/>
+          <w:szCs w:val="32"/>
         </w:rPr>
         <w:lastRenderedPageBreak/>
+        <w:t>SPI Resistance Factors and ROI</w:t>
+      </w:r>
+    </w:p>
+    <w:p>
+      <w:pPr>
+        <w:pStyle w:val="Heading2"/>
+        <w:rPr>
+          <w:rFonts w:asciiTheme="majorBidi" w:hAnsiTheme="majorBidi"/>
+          <w:b/>
+          <w:bCs/>
+          <w:color w:val="auto"/>
+          <w:lang w:bidi="ar-SA"/>
+        </w:rPr>
+      </w:pPr>
+      <w:r>
+        <w:rPr>
+          <w:rFonts w:asciiTheme="majorBidi" w:hAnsiTheme="majorBidi"/>
+          <w:b/>
+          <w:bCs/>
+          <w:color w:val="auto"/>
+        </w:rPr>
         <w:t>Part 1: Why Do People and Companies Resist SPI?</w:t>
       </w:r>
     </w:p>
     <w:p>
       <w:pPr>
         <w:pStyle w:val="NormalWeb"/>
-      </w:pPr>
-      <w:r>
+        <w:rPr>
+          <w:rFonts w:asciiTheme="majorBidi" w:hAnsiTheme="majorBidi" w:cstheme="majorBidi"/>
+        </w:rPr>
+      </w:pPr>
+      <w:r>
+        <w:rPr>
+          <w:rFonts w:asciiTheme="majorBidi" w:hAnsiTheme="majorBidi" w:cstheme="majorBidi"/>
+        </w:rPr>
         <w:t>Software Process Improvement (SPI) means changing how a company builds software to make it better. However, people naturally hate change. The lecture breaks this resistance down into 4 levels:</w:t>
       </w:r>
     </w:p>
     <w:p>
       <w:pPr>
         <w:pStyle w:val="Heading3"/>
-      </w:pPr>
-      <w:r>
+        <w:rPr>
+          <w:rFonts w:asciiTheme="majorBidi" w:hAnsiTheme="majorBidi" w:cstheme="majorBidi"/>
+        </w:rPr>
+      </w:pPr>
+      <w:r>
+        <w:rPr>
+          <w:rFonts w:asciiTheme="majorBidi" w:hAnsiTheme="majorBidi" w:cstheme="majorBidi"/>
+        </w:rPr>
         <w:t>1. Individual-Level Resistance (The Developers' Perspective)</w:t>
       </w:r>
     </w:p>
     <w:p>
       <w:pPr>
         <w:pStyle w:val="NormalWeb"/>
-      </w:pPr>
-      <w:r>
+        <w:rPr>
+          <w:rFonts w:asciiTheme="majorBidi" w:hAnsiTheme="majorBidi" w:cstheme="majorBidi"/>
+        </w:rPr>
+      </w:pPr>
+      <w:r>
+        <w:rPr>
+          <w:rFonts w:asciiTheme="majorBidi" w:hAnsiTheme="majorBidi" w:cstheme="majorBidi"/>
+        </w:rPr>
         <w:t>This comes from the personal feelings and habits of the developers themselves.</w:t>
       </w:r>
     </w:p>
@@ -2414,22 +2360,23 @@
           <w:ilvl w:val="0"/>
           <w:numId w:val="13"/>
         </w:numPr>
-      </w:pPr>
-      <w:r>
-        <w:rPr>
+        <w:rPr>
+          <w:rFonts w:asciiTheme="majorBidi" w:hAnsiTheme="majorBidi" w:cstheme="majorBidi"/>
+        </w:rPr>
+      </w:pPr>
+      <w:r>
+        <w:rPr>
+          <w:rFonts w:asciiTheme="majorBidi" w:hAnsiTheme="majorBidi" w:cstheme="majorBidi"/>
           <w:b/>
           <w:bCs/>
         </w:rPr>
         <w:t>Fear of incompetence:</w:t>
       </w:r>
       <w:r>
-        <w:t xml:space="preserve"> </w:t>
-      </w:r>
-      <w:r>
-        <w:t>Developers might feel that new processes will show their weaknesses</w:t>
-      </w:r>
-      <w:r>
-        <w:t>.</w:t>
+        <w:rPr>
+          <w:rFonts w:asciiTheme="majorBidi" w:hAnsiTheme="majorBidi" w:cstheme="majorBidi"/>
+        </w:rPr>
+        <w:t xml:space="preserve"> Developers might feel that new processes will show their weaknesses.</w:t>
       </w:r>
     </w:p>
     <w:p>
@@ -2439,19 +2386,27 @@
           <w:ilvl w:val="0"/>
           <w:numId w:val="13"/>
         </w:numPr>
-      </w:pPr>
-      <w:r>
-        <w:rPr>
+        <w:rPr>
+          <w:rFonts w:asciiTheme="majorBidi" w:hAnsiTheme="majorBidi" w:cstheme="majorBidi"/>
+        </w:rPr>
+      </w:pPr>
+      <w:r>
+        <w:rPr>
+          <w:rFonts w:asciiTheme="majorBidi" w:hAnsiTheme="majorBidi" w:cstheme="majorBidi"/>
           <w:b/>
           <w:bCs/>
         </w:rPr>
         <w:t>Comfort with the status quo:</w:t>
       </w:r>
       <w:r>
+        <w:rPr>
+          <w:rFonts w:asciiTheme="majorBidi" w:hAnsiTheme="majorBidi" w:cstheme="majorBidi"/>
+        </w:rPr>
         <w:t xml:space="preserve"> Experienced engineers often think, </w:t>
       </w:r>
       <w:r>
         <w:rPr>
+          <w:rFonts w:asciiTheme="majorBidi" w:hAnsiTheme="majorBidi" w:cstheme="majorBidi"/>
           <w:i/>
           <w:iCs/>
         </w:rPr>
@@ -2465,25 +2420,36 @@
           <w:ilvl w:val="0"/>
           <w:numId w:val="13"/>
         </w:numPr>
-      </w:pPr>
-      <w:r>
-        <w:rPr>
+        <w:rPr>
+          <w:rFonts w:asciiTheme="majorBidi" w:hAnsiTheme="majorBidi" w:cstheme="majorBidi"/>
+        </w:rPr>
+      </w:pPr>
+      <w:r>
+        <w:rPr>
+          <w:rFonts w:asciiTheme="majorBidi" w:hAnsiTheme="majorBidi" w:cstheme="majorBidi"/>
           <w:b/>
           <w:bCs/>
         </w:rPr>
         <w:t>Lack of awareness:</w:t>
       </w:r>
       <w:r>
+        <w:rPr>
+          <w:rFonts w:asciiTheme="majorBidi" w:hAnsiTheme="majorBidi" w:cstheme="majorBidi"/>
+        </w:rPr>
         <w:t xml:space="preserve"> They simply don’t know </w:t>
       </w:r>
       <w:r>
         <w:rPr>
+          <w:rFonts w:asciiTheme="majorBidi" w:hAnsiTheme="majorBidi" w:cstheme="majorBidi"/>
           <w:i/>
           <w:iCs/>
         </w:rPr>
         <w:t>why</w:t>
       </w:r>
       <w:r>
+        <w:rPr>
+          <w:rFonts w:asciiTheme="majorBidi" w:hAnsiTheme="majorBidi" w:cstheme="majorBidi"/>
+        </w:rPr>
         <w:t xml:space="preserve"> the boss wants to change things because no one explained the benefits.</w:t>
       </w:r>
     </w:p>
@@ -2494,34 +2460,56 @@
           <w:ilvl w:val="0"/>
           <w:numId w:val="13"/>
         </w:numPr>
-      </w:pPr>
-      <w:r>
-        <w:rPr>
+        <w:rPr>
+          <w:rFonts w:asciiTheme="majorBidi" w:hAnsiTheme="majorBidi" w:cstheme="majorBidi"/>
+        </w:rPr>
+      </w:pPr>
+      <w:r>
+        <w:rPr>
+          <w:rFonts w:asciiTheme="majorBidi" w:hAnsiTheme="majorBidi" w:cstheme="majorBidi"/>
           <w:b/>
           <w:bCs/>
         </w:rPr>
         <w:t>Low motivation to change:</w:t>
       </w:r>
       <w:r>
+        <w:rPr>
+          <w:rFonts w:asciiTheme="majorBidi" w:hAnsiTheme="majorBidi" w:cstheme="majorBidi"/>
+        </w:rPr>
         <w:t xml:space="preserve"> </w:t>
       </w:r>
       <w:r>
+        <w:rPr>
+          <w:rFonts w:asciiTheme="majorBidi" w:hAnsiTheme="majorBidi" w:cstheme="majorBidi"/>
+        </w:rPr>
         <w:t>Without rewards or bonuses, developers will quickly go back to their old habits.</w:t>
       </w:r>
     </w:p>
     <w:p>
       <w:pPr>
         <w:pStyle w:val="Heading3"/>
-      </w:pPr>
-      <w:r>
+        <w:rPr>
+          <w:rFonts w:asciiTheme="majorBidi" w:hAnsiTheme="majorBidi" w:cstheme="majorBidi"/>
+        </w:rPr>
+      </w:pPr>
+      <w:r>
+        <w:rPr>
+          <w:rFonts w:asciiTheme="majorBidi" w:hAnsiTheme="majorBidi" w:cstheme="majorBidi"/>
+        </w:rPr>
         <w:t>2. Organizational-Level Resistance (The Company Culture)</w:t>
       </w:r>
     </w:p>
     <w:p>
       <w:pPr>
         <w:pStyle w:val="NormalWeb"/>
-      </w:pPr>
-      <w:r>
+        <w:rPr>
+          <w:rFonts w:asciiTheme="majorBidi" w:hAnsiTheme="majorBidi" w:cstheme="majorBidi"/>
+        </w:rPr>
+      </w:pPr>
+      <w:r>
+        <w:rPr>
+          <w:rFonts w:asciiTheme="majorBidi" w:hAnsiTheme="majorBidi" w:cstheme="majorBidi"/>
+        </w:rPr>
         <w:t>This stems from the environment, politics, and setup of the company.</w:t>
       </w:r>
     </w:p>
@@ -2532,15 +2520,22 @@
           <w:ilvl w:val="0"/>
           <w:numId w:val="14"/>
         </w:numPr>
-      </w:pPr>
-      <w:r>
-        <w:rPr>
+        <w:rPr>
+          <w:rFonts w:asciiTheme="majorBidi" w:hAnsiTheme="majorBidi" w:cstheme="majorBidi"/>
+        </w:rPr>
+      </w:pPr>
+      <w:r>
+        <w:rPr>
+          <w:rFonts w:asciiTheme="majorBidi" w:hAnsiTheme="majorBidi" w:cstheme="majorBidi"/>
           <w:b/>
           <w:bCs/>
         </w:rPr>
         <w:t>Culture of blame:</w:t>
       </w:r>
       <w:r>
+        <w:rPr>
+          <w:rFonts w:asciiTheme="majorBidi" w:hAnsiTheme="majorBidi" w:cstheme="majorBidi"/>
+        </w:rPr>
         <w:t xml:space="preserve"> If a company punishes mistakes, people won't try new processes because they are afraid of failing.</w:t>
       </w:r>
     </w:p>
@@ -2551,21 +2546,34 @@
           <w:ilvl w:val="0"/>
           <w:numId w:val="14"/>
         </w:numPr>
-      </w:pPr>
-      <w:r>
-        <w:rPr>
+        <w:rPr>
+          <w:rFonts w:asciiTheme="majorBidi" w:hAnsiTheme="majorBidi" w:cstheme="majorBidi"/>
+        </w:rPr>
+      </w:pPr>
+      <w:r>
+        <w:rPr>
+          <w:rFonts w:asciiTheme="majorBidi" w:hAnsiTheme="majorBidi" w:cstheme="majorBidi"/>
           <w:b/>
           <w:bCs/>
         </w:rPr>
         <w:t>Resource constraints:</w:t>
       </w:r>
       <w:r>
+        <w:rPr>
+          <w:rFonts w:asciiTheme="majorBidi" w:hAnsiTheme="majorBidi" w:cstheme="majorBidi"/>
+        </w:rPr>
         <w:t xml:space="preserve"> </w:t>
       </w:r>
       <w:r>
+        <w:rPr>
+          <w:rFonts w:asciiTheme="majorBidi" w:hAnsiTheme="majorBidi" w:cstheme="majorBidi"/>
+        </w:rPr>
         <w:t>Process improvement takes time, money, and people. When resources are tight, teams stop improving and focus only on delivery.</w:t>
       </w:r>
       <w:r>
+        <w:rPr>
+          <w:rFonts w:asciiTheme="majorBidi" w:hAnsiTheme="majorBidi" w:cstheme="majorBidi"/>
+        </w:rPr>
         <w:t xml:space="preserve"> </w:t>
       </w:r>
     </w:p>
@@ -2576,15 +2584,22 @@
           <w:ilvl w:val="0"/>
           <w:numId w:val="14"/>
         </w:numPr>
-      </w:pPr>
-      <w:r>
-        <w:rPr>
+        <w:rPr>
+          <w:rFonts w:asciiTheme="majorBidi" w:hAnsiTheme="majorBidi" w:cstheme="majorBidi"/>
+        </w:rPr>
+      </w:pPr>
+      <w:r>
+        <w:rPr>
+          <w:rFonts w:asciiTheme="majorBidi" w:hAnsiTheme="majorBidi" w:cstheme="majorBidi"/>
           <w:b/>
           <w:bCs/>
         </w:rPr>
         <w:t>Siloed departments:</w:t>
       </w:r>
       <w:r>
+        <w:rPr>
+          <w:rFonts w:asciiTheme="majorBidi" w:hAnsiTheme="majorBidi" w:cstheme="majorBidi"/>
+        </w:rPr>
         <w:t xml:space="preserve"> Teams (like Coders, QA testers, and Managers) don't talk to each other, so everyone follows a different plan.</w:t>
       </w:r>
     </w:p>
@@ -2595,22 +2610,29 @@
           <w:ilvl w:val="0"/>
           <w:numId w:val="14"/>
         </w:numPr>
-      </w:pPr>
-      <w:r>
-        <w:rPr>
+        <w:rPr>
+          <w:rFonts w:asciiTheme="majorBidi" w:hAnsiTheme="majorBidi" w:cstheme="majorBidi"/>
+        </w:rPr>
+      </w:pPr>
+      <w:r>
+        <w:rPr>
+          <w:rFonts w:asciiTheme="majorBidi" w:hAnsiTheme="majorBidi" w:cstheme="majorBidi"/>
           <w:b/>
           <w:bCs/>
         </w:rPr>
         <w:t>Cultural resistance to change:</w:t>
       </w:r>
       <w:r>
+        <w:rPr>
+          <w:rFonts w:asciiTheme="majorBidi" w:hAnsiTheme="majorBidi" w:cstheme="majorBidi"/>
+        </w:rPr>
         <w:t xml:space="preserve"> </w:t>
       </w:r>
       <w:r>
-        <w:t>T</w:t>
-      </w:r>
-      <w:r>
-        <w:t>raditional organizations face the highest resistance when trying to change</w:t>
+        <w:rPr>
+          <w:rFonts w:asciiTheme="majorBidi" w:hAnsiTheme="majorBidi" w:cstheme="majorBidi"/>
+        </w:rPr>
+        <w:t>Traditional organizations face the highest resistance when trying to change</w:t>
       </w:r>
     </w:p>
     <w:p>
@@ -2620,40 +2642,56 @@
           <w:ilvl w:val="0"/>
           <w:numId w:val="14"/>
         </w:numPr>
-      </w:pPr>
-      <w:r>
-        <w:rPr>
+        <w:rPr>
+          <w:rFonts w:asciiTheme="majorBidi" w:hAnsiTheme="majorBidi" w:cstheme="majorBidi"/>
+        </w:rPr>
+      </w:pPr>
+      <w:r>
+        <w:rPr>
+          <w:rFonts w:asciiTheme="majorBidi" w:hAnsiTheme="majorBidi" w:cstheme="majorBidi"/>
           <w:b/>
           <w:bCs/>
         </w:rPr>
         <w:t>Poor communication:</w:t>
       </w:r>
       <w:r>
+        <w:rPr>
+          <w:rFonts w:asciiTheme="majorBidi" w:hAnsiTheme="majorBidi" w:cstheme="majorBidi"/>
+        </w:rPr>
         <w:t xml:space="preserve"> </w:t>
       </w:r>
       <w:r>
-        <w:t xml:space="preserve">Without clear communication about goals and benefits, teams </w:t>
-      </w:r>
-      <w:r>
-        <w:t>get</w:t>
-      </w:r>
-      <w:r>
-        <w:t xml:space="preserve"> confused instead of supportive</w:t>
+        <w:rPr>
+          <w:rFonts w:asciiTheme="majorBidi" w:hAnsiTheme="majorBidi" w:cstheme="majorBidi"/>
+        </w:rPr>
+        <w:t>Without clear communication about goals and benefits, teams get confused instead of supportive</w:t>
       </w:r>
     </w:p>
     <w:p>
       <w:pPr>
         <w:pStyle w:val="Heading3"/>
-      </w:pPr>
-      <w:r>
+        <w:rPr>
+          <w:rFonts w:asciiTheme="majorBidi" w:hAnsiTheme="majorBidi" w:cstheme="majorBidi"/>
+        </w:rPr>
+      </w:pPr>
+      <w:r>
+        <w:rPr>
+          <w:rFonts w:asciiTheme="majorBidi" w:hAnsiTheme="majorBidi" w:cstheme="majorBidi"/>
+        </w:rPr>
         <w:t>3. Process-Level Resistance (The Flaws in the New Rules)</w:t>
       </w:r>
     </w:p>
     <w:p>
       <w:pPr>
         <w:pStyle w:val="NormalWeb"/>
-      </w:pPr>
-      <w:r>
+        <w:rPr>
+          <w:rFonts w:asciiTheme="majorBidi" w:hAnsiTheme="majorBidi" w:cstheme="majorBidi"/>
+        </w:rPr>
+      </w:pPr>
+      <w:r>
+        <w:rPr>
+          <w:rFonts w:asciiTheme="majorBidi" w:hAnsiTheme="majorBidi" w:cstheme="majorBidi"/>
+        </w:rPr>
         <w:t>Sometimes, the new process itself is the problem.</w:t>
       </w:r>
     </w:p>
@@ -2664,18 +2702,28 @@
           <w:ilvl w:val="0"/>
           <w:numId w:val="15"/>
         </w:numPr>
-      </w:pPr>
-      <w:r>
-        <w:rPr>
+        <w:rPr>
+          <w:rFonts w:asciiTheme="majorBidi" w:hAnsiTheme="majorBidi" w:cstheme="majorBidi"/>
+        </w:rPr>
+      </w:pPr>
+      <w:r>
+        <w:rPr>
+          <w:rFonts w:asciiTheme="majorBidi" w:hAnsiTheme="majorBidi" w:cstheme="majorBidi"/>
           <w:b/>
           <w:bCs/>
         </w:rPr>
         <w:t>Complexity of proposed changes:</w:t>
       </w:r>
       <w:r>
+        <w:rPr>
+          <w:rFonts w:asciiTheme="majorBidi" w:hAnsiTheme="majorBidi" w:cstheme="majorBidi"/>
+        </w:rPr>
         <w:t xml:space="preserve"> </w:t>
       </w:r>
       <w:r>
+        <w:rPr>
+          <w:rFonts w:asciiTheme="majorBidi" w:hAnsiTheme="majorBidi" w:cstheme="majorBidi"/>
+        </w:rPr>
         <w:t>If a new process is too complicated, teams will abandon it when deadlines get tight.</w:t>
       </w:r>
     </w:p>
@@ -2686,21 +2734,34 @@
           <w:ilvl w:val="0"/>
           <w:numId w:val="15"/>
         </w:numPr>
-      </w:pPr>
-      <w:r>
-        <w:rPr>
+        <w:rPr>
+          <w:rFonts w:asciiTheme="majorBidi" w:hAnsiTheme="majorBidi" w:cstheme="majorBidi"/>
+        </w:rPr>
+      </w:pPr>
+      <w:r>
+        <w:rPr>
+          <w:rFonts w:asciiTheme="majorBidi" w:hAnsiTheme="majorBidi" w:cstheme="majorBidi"/>
           <w:b/>
           <w:bCs/>
         </w:rPr>
         <w:t>Lack of measurement systems:</w:t>
       </w:r>
       <w:r>
+        <w:rPr>
+          <w:rFonts w:asciiTheme="majorBidi" w:hAnsiTheme="majorBidi" w:cstheme="majorBidi"/>
+        </w:rPr>
         <w:t xml:space="preserve"> </w:t>
       </w:r>
       <w:r>
+        <w:rPr>
+          <w:rFonts w:asciiTheme="majorBidi" w:hAnsiTheme="majorBidi" w:cstheme="majorBidi"/>
+        </w:rPr>
         <w:t>Without metrics, you cannot prove improvement, making everyone skeptical about whether the changes work.</w:t>
       </w:r>
       <w:r>
+        <w:rPr>
+          <w:rFonts w:asciiTheme="majorBidi" w:hAnsiTheme="majorBidi" w:cstheme="majorBidi"/>
+        </w:rPr>
         <w:t xml:space="preserve"> </w:t>
       </w:r>
     </w:p>
@@ -2711,15 +2772,22 @@
           <w:ilvl w:val="0"/>
           <w:numId w:val="15"/>
         </w:numPr>
-      </w:pPr>
-      <w:r>
-        <w:rPr>
+        <w:rPr>
+          <w:rFonts w:asciiTheme="majorBidi" w:hAnsiTheme="majorBidi" w:cstheme="majorBidi"/>
+        </w:rPr>
+      </w:pPr>
+      <w:r>
+        <w:rPr>
+          <w:rFonts w:asciiTheme="majorBidi" w:hAnsiTheme="majorBidi" w:cstheme="majorBidi"/>
           <w:b/>
           <w:bCs/>
         </w:rPr>
         <w:t>Immature baselines:</w:t>
       </w:r>
       <w:r>
+        <w:rPr>
+          <w:rFonts w:asciiTheme="majorBidi" w:hAnsiTheme="majorBidi" w:cstheme="majorBidi"/>
+        </w:rPr>
         <w:t xml:space="preserve"> You cannot improve what you do not measure. If you don't know your current speed/quality, you can't track growth.</w:t>
       </w:r>
     </w:p>
@@ -2730,20 +2798,28 @@
           <w:ilvl w:val="0"/>
           <w:numId w:val="15"/>
         </w:numPr>
-      </w:pPr>
-      <w:r>
-        <w:rPr>
-          <w:b/>
-          <w:bCs/>
-        </w:rPr>
+        <w:rPr>
+          <w:rFonts w:asciiTheme="majorBidi" w:hAnsiTheme="majorBidi" w:cstheme="majorBidi"/>
+        </w:rPr>
+      </w:pPr>
+      <w:r>
+        <w:rPr>
+          <w:rFonts w:asciiTheme="majorBidi" w:hAnsiTheme="majorBidi" w:cstheme="majorBidi"/>
+          <w:b/>
+          <w:bCs/>
+        </w:rPr>
+        <w:lastRenderedPageBreak/>
         <w:t>Poorly defined processes:</w:t>
       </w:r>
       <w:r>
+        <w:rPr>
+          <w:rFonts w:asciiTheme="majorBidi" w:hAnsiTheme="majorBidi" w:cstheme="majorBidi"/>
+        </w:rPr>
         <w:t xml:space="preserve"> </w:t>
       </w:r>
       <w:r>
         <w:rPr>
-          <w:rFonts w:ascii="Arial" w:hAnsi="Arial" w:cs="Arial"/>
+          <w:rFonts w:asciiTheme="majorBidi" w:hAnsiTheme="majorBidi" w:cstheme="majorBidi"/>
         </w:rPr>
         <w:t>Unclear rules lead to different interpretations, which ruins consistency.</w:t>
       </w:r>
@@ -2755,32 +2831,50 @@
           <w:ilvl w:val="0"/>
           <w:numId w:val="15"/>
         </w:numPr>
-      </w:pPr>
-      <w:r>
-        <w:rPr>
-          <w:b/>
-          <w:bCs/>
-        </w:rPr>
-        <w:lastRenderedPageBreak/>
+        <w:rPr>
+          <w:rFonts w:asciiTheme="majorBidi" w:hAnsiTheme="majorBidi" w:cstheme="majorBidi"/>
+        </w:rPr>
+      </w:pPr>
+      <w:r>
+        <w:rPr>
+          <w:rFonts w:asciiTheme="majorBidi" w:hAnsiTheme="majorBidi" w:cstheme="majorBidi"/>
+          <w:b/>
+          <w:bCs/>
+        </w:rPr>
         <w:t>Irrelevance to context:</w:t>
       </w:r>
       <w:r>
+        <w:rPr>
+          <w:rFonts w:asciiTheme="majorBidi" w:hAnsiTheme="majorBidi" w:cstheme="majorBidi"/>
+        </w:rPr>
         <w:t xml:space="preserve"> Copying a massive corporate framework (like one used by Google) and forcing it onto a 5-person startup team will fail.</w:t>
       </w:r>
     </w:p>
     <w:p>
       <w:pPr>
         <w:pStyle w:val="Heading3"/>
-      </w:pPr>
-      <w:r>
+        <w:rPr>
+          <w:rFonts w:asciiTheme="majorBidi" w:hAnsiTheme="majorBidi" w:cstheme="majorBidi"/>
+        </w:rPr>
+      </w:pPr>
+      <w:r>
+        <w:rPr>
+          <w:rFonts w:asciiTheme="majorBidi" w:hAnsiTheme="majorBidi" w:cstheme="majorBidi"/>
+        </w:rPr>
         <w:t>4. Management-Level Resistance (The Bosses' Perspective)</w:t>
       </w:r>
     </w:p>
     <w:p>
       <w:pPr>
         <w:pStyle w:val="NormalWeb"/>
-      </w:pPr>
-      <w:r>
+        <w:rPr>
+          <w:rFonts w:asciiTheme="majorBidi" w:hAnsiTheme="majorBidi" w:cstheme="majorBidi"/>
+        </w:rPr>
+      </w:pPr>
+      <w:r>
+        <w:rPr>
+          <w:rFonts w:asciiTheme="majorBidi" w:hAnsiTheme="majorBidi" w:cstheme="majorBidi"/>
+        </w:rPr>
         <w:t>Managers control the money and schedule, so if they aren't on board, SPI dies.</w:t>
       </w:r>
     </w:p>
@@ -2793,15 +2887,15 @@
         </w:numPr>
         <w:spacing w:after="0" w:line="240" w:lineRule="auto"/>
         <w:rPr>
-          <w:rFonts w:ascii="Times New Roman" w:eastAsia="Times New Roman" w:hAnsi="Times New Roman" w:cs="Times New Roman"/>
-          <w:sz w:val="24"/>
-          <w:szCs w:val="24"/>
-          <w:lang w:bidi="ar-SA"/>
-        </w:rPr>
-      </w:pPr>
-      <w:r>
-        <w:rPr>
-          <w:rFonts w:ascii="Arial" w:eastAsia="Times New Roman" w:hAnsi="Arial" w:cs="Arial"/>
+          <w:rFonts w:asciiTheme="majorBidi" w:eastAsia="Times New Roman" w:hAnsiTheme="majorBidi" w:cstheme="majorBidi"/>
+          <w:sz w:val="24"/>
+          <w:szCs w:val="24"/>
+          <w:lang w:bidi="ar-SA"/>
+        </w:rPr>
+      </w:pPr>
+      <w:r>
+        <w:rPr>
+          <w:rFonts w:asciiTheme="majorBidi" w:eastAsia="Times New Roman" w:hAnsiTheme="majorBidi" w:cstheme="majorBidi"/>
           <w:b/>
           <w:bCs/>
           <w:sz w:val="24"/>
@@ -2812,7 +2906,7 @@
       </w:r>
       <w:r>
         <w:rPr>
-          <w:rFonts w:ascii="Arial" w:eastAsia="Times New Roman" w:hAnsi="Arial" w:cs="Arial"/>
+          <w:rFonts w:asciiTheme="majorBidi" w:eastAsia="Times New Roman" w:hAnsiTheme="majorBidi" w:cstheme="majorBidi"/>
           <w:sz w:val="24"/>
           <w:szCs w:val="24"/>
           <w:lang w:bidi="ar-SA"/>
@@ -2829,15 +2923,15 @@
         </w:numPr>
         <w:spacing w:after="0" w:line="240" w:lineRule="auto"/>
         <w:rPr>
-          <w:rFonts w:ascii="Times New Roman" w:eastAsia="Times New Roman" w:hAnsi="Times New Roman" w:cs="Times New Roman"/>
-          <w:sz w:val="24"/>
-          <w:szCs w:val="24"/>
-          <w:lang w:bidi="ar-SA"/>
-        </w:rPr>
-      </w:pPr>
-      <w:r>
-        <w:rPr>
-          <w:rFonts w:ascii="Arial" w:eastAsia="Times New Roman" w:hAnsi="Arial" w:cs="Arial"/>
+          <w:rFonts w:asciiTheme="majorBidi" w:eastAsia="Times New Roman" w:hAnsiTheme="majorBidi" w:cstheme="majorBidi"/>
+          <w:sz w:val="24"/>
+          <w:szCs w:val="24"/>
+          <w:lang w:bidi="ar-SA"/>
+        </w:rPr>
+      </w:pPr>
+      <w:r>
+        <w:rPr>
+          <w:rFonts w:asciiTheme="majorBidi" w:eastAsia="Times New Roman" w:hAnsiTheme="majorBidi" w:cstheme="majorBidi"/>
           <w:b/>
           <w:bCs/>
           <w:sz w:val="24"/>
@@ -2848,7 +2942,7 @@
       </w:r>
       <w:r>
         <w:rPr>
-          <w:rFonts w:ascii="Arial" w:eastAsia="Times New Roman" w:hAnsi="Arial" w:cs="Arial"/>
+          <w:rFonts w:asciiTheme="majorBidi" w:eastAsia="Times New Roman" w:hAnsiTheme="majorBidi" w:cstheme="majorBidi"/>
           <w:sz w:val="24"/>
           <w:szCs w:val="24"/>
           <w:lang w:bidi="ar-SA"/>
@@ -2865,15 +2959,15 @@
         </w:numPr>
         <w:spacing w:after="0" w:line="240" w:lineRule="auto"/>
         <w:rPr>
-          <w:rFonts w:ascii="Times New Roman" w:eastAsia="Times New Roman" w:hAnsi="Times New Roman" w:cs="Times New Roman"/>
-          <w:sz w:val="24"/>
-          <w:szCs w:val="24"/>
-          <w:lang w:bidi="ar-SA"/>
-        </w:rPr>
-      </w:pPr>
-      <w:r>
-        <w:rPr>
-          <w:rFonts w:ascii="Arial" w:eastAsia="Times New Roman" w:hAnsi="Arial" w:cs="Arial"/>
+          <w:rFonts w:asciiTheme="majorBidi" w:eastAsia="Times New Roman" w:hAnsiTheme="majorBidi" w:cstheme="majorBidi"/>
+          <w:sz w:val="24"/>
+          <w:szCs w:val="24"/>
+          <w:lang w:bidi="ar-SA"/>
+        </w:rPr>
+      </w:pPr>
+      <w:r>
+        <w:rPr>
+          <w:rFonts w:asciiTheme="majorBidi" w:eastAsia="Times New Roman" w:hAnsiTheme="majorBidi" w:cstheme="majorBidi"/>
           <w:b/>
           <w:bCs/>
           <w:sz w:val="24"/>
@@ -2884,7 +2978,7 @@
       </w:r>
       <w:r>
         <w:rPr>
-          <w:rFonts w:ascii="Arial" w:eastAsia="Times New Roman" w:hAnsi="Arial" w:cs="Arial"/>
+          <w:rFonts w:asciiTheme="majorBidi" w:eastAsia="Times New Roman" w:hAnsiTheme="majorBidi" w:cstheme="majorBidi"/>
           <w:sz w:val="24"/>
           <w:szCs w:val="24"/>
           <w:lang w:bidi="ar-SA"/>
@@ -2901,15 +2995,15 @@
         </w:numPr>
         <w:spacing w:after="0" w:line="240" w:lineRule="auto"/>
         <w:rPr>
-          <w:rFonts w:ascii="Times New Roman" w:eastAsia="Times New Roman" w:hAnsi="Times New Roman" w:cs="Times New Roman"/>
-          <w:sz w:val="24"/>
-          <w:szCs w:val="24"/>
-          <w:lang w:bidi="ar-SA"/>
-        </w:rPr>
-      </w:pPr>
-      <w:r>
-        <w:rPr>
-          <w:rFonts w:ascii="Arial" w:eastAsia="Times New Roman" w:hAnsi="Arial" w:cs="Arial"/>
+          <w:rFonts w:asciiTheme="majorBidi" w:eastAsia="Times New Roman" w:hAnsiTheme="majorBidi" w:cstheme="majorBidi"/>
+          <w:sz w:val="24"/>
+          <w:szCs w:val="24"/>
+          <w:lang w:bidi="ar-SA"/>
+        </w:rPr>
+      </w:pPr>
+      <w:r>
+        <w:rPr>
+          <w:rFonts w:asciiTheme="majorBidi" w:eastAsia="Times New Roman" w:hAnsiTheme="majorBidi" w:cstheme="majorBidi"/>
           <w:b/>
           <w:bCs/>
           <w:sz w:val="24"/>
@@ -2920,7 +3014,7 @@
       </w:r>
       <w:r>
         <w:rPr>
-          <w:rFonts w:ascii="Arial" w:eastAsia="Times New Roman" w:hAnsi="Arial" w:cs="Arial"/>
+          <w:rFonts w:asciiTheme="majorBidi" w:eastAsia="Times New Roman" w:hAnsiTheme="majorBidi" w:cstheme="majorBidi"/>
           <w:sz w:val="24"/>
           <w:szCs w:val="24"/>
           <w:lang w:bidi="ar-SA"/>
@@ -2935,10 +3029,13 @@
           <w:ilvl w:val="0"/>
           <w:numId w:val="18"/>
         </w:numPr>
-      </w:pPr>
-      <w:r>
-        <w:rPr>
-          <w:rFonts w:ascii="Arial" w:hAnsi="Arial" w:cs="Arial"/>
+        <w:rPr>
+          <w:rFonts w:asciiTheme="majorBidi" w:hAnsiTheme="majorBidi" w:cstheme="majorBidi"/>
+        </w:rPr>
+      </w:pPr>
+      <w:r>
+        <w:rPr>
+          <w:rFonts w:asciiTheme="majorBidi" w:hAnsiTheme="majorBidi" w:cstheme="majorBidi"/>
           <w:b/>
           <w:bCs/>
         </w:rPr>
@@ -2946,7 +3043,7 @@
       </w:r>
       <w:r>
         <w:rPr>
-          <w:rFonts w:ascii="Arial" w:hAnsi="Arial" w:cs="Arial"/>
+          <w:rFonts w:asciiTheme="majorBidi" w:hAnsiTheme="majorBidi" w:cstheme="majorBidi"/>
         </w:rPr>
         <w:t>: When deadlines get tight, managers will always sacrifice the new process.</w:t>
       </w:r>
@@ -2955,7 +3052,7 @@
       <w:pPr>
         <w:pStyle w:val="Heading2"/>
         <w:rPr>
-          <w:rFonts w:ascii="Times New Roman" w:hAnsi="Times New Roman" w:cs="Times New Roman"/>
+          <w:rFonts w:asciiTheme="majorBidi" w:hAnsiTheme="majorBidi"/>
           <w:b/>
           <w:bCs/>
           <w:color w:val="auto"/>
@@ -2963,7 +3060,7 @@
       </w:pPr>
       <w:r>
         <w:rPr>
-          <w:rFonts w:ascii="Times New Roman" w:hAnsi="Times New Roman" w:cs="Times New Roman"/>
+          <w:rFonts w:asciiTheme="majorBidi" w:hAnsiTheme="majorBidi"/>
           <w:b/>
           <w:bCs/>
           <w:color w:val="auto"/>
@@ -2974,18 +3071,28 @@
     <w:p>
       <w:pPr>
         <w:pStyle w:val="NormalWeb"/>
-      </w:pPr>
-      <w:r>
+        <w:rPr>
+          <w:rFonts w:asciiTheme="majorBidi" w:hAnsiTheme="majorBidi" w:cstheme="majorBidi"/>
+        </w:rPr>
+      </w:pPr>
+      <w:r>
+        <w:rPr>
+          <w:rFonts w:asciiTheme="majorBidi" w:hAnsiTheme="majorBidi" w:cstheme="majorBidi"/>
+        </w:rPr>
         <w:t xml:space="preserve">If changing things is so painful, why do it? This section explains the </w:t>
       </w:r>
       <w:r>
         <w:rPr>
+          <w:rFonts w:asciiTheme="majorBidi" w:hAnsiTheme="majorBidi" w:cstheme="majorBidi"/>
           <w:b/>
           <w:bCs/>
         </w:rPr>
         <w:t>lifecycle of how spending time and money on SPI actually makes a company richer</w:t>
       </w:r>
       <w:r>
+        <w:rPr>
+          <w:rFonts w:asciiTheme="majorBidi" w:hAnsiTheme="majorBidi" w:cstheme="majorBidi"/>
+        </w:rPr>
         <w:t xml:space="preserve"> in the long run.</w:t>
       </w:r>
     </w:p>
@@ -2996,15 +3103,22 @@
           <w:ilvl w:val="0"/>
           <w:numId w:val="17"/>
         </w:numPr>
-      </w:pPr>
-      <w:r>
-        <w:rPr>
+        <w:rPr>
+          <w:rFonts w:asciiTheme="majorBidi" w:hAnsiTheme="majorBidi" w:cstheme="majorBidi"/>
+        </w:rPr>
+      </w:pPr>
+      <w:r>
+        <w:rPr>
+          <w:rFonts w:asciiTheme="majorBidi" w:hAnsiTheme="majorBidi" w:cstheme="majorBidi"/>
           <w:b/>
           <w:bCs/>
         </w:rPr>
         <w:t>SPI Investment:</w:t>
       </w:r>
       <w:r>
+        <w:rPr>
+          <w:rFonts w:asciiTheme="majorBidi" w:hAnsiTheme="majorBidi" w:cstheme="majorBidi"/>
+        </w:rPr>
         <w:t xml:space="preserve"> First, you spend money and time on training developers, buying better tools, or hiring experts.</w:t>
       </w:r>
     </w:p>
@@ -3015,15 +3129,22 @@
           <w:ilvl w:val="0"/>
           <w:numId w:val="17"/>
         </w:numPr>
-      </w:pPr>
-      <w:r>
-        <w:rPr>
+        <w:rPr>
+          <w:rFonts w:asciiTheme="majorBidi" w:hAnsiTheme="majorBidi" w:cstheme="majorBidi"/>
+        </w:rPr>
+      </w:pPr>
+      <w:r>
+        <w:rPr>
+          <w:rFonts w:asciiTheme="majorBidi" w:hAnsiTheme="majorBidi" w:cstheme="majorBidi"/>
           <w:b/>
           <w:bCs/>
         </w:rPr>
         <w:t>Process Improvement:</w:t>
       </w:r>
       <w:r>
+        <w:rPr>
+          <w:rFonts w:asciiTheme="majorBidi" w:hAnsiTheme="majorBidi" w:cstheme="majorBidi"/>
+        </w:rPr>
         <w:t xml:space="preserve"> Because of the investment, the team adopts better coding standards and starts measuring their work.</w:t>
       </w:r>
     </w:p>
@@ -3034,15 +3155,22 @@
           <w:ilvl w:val="0"/>
           <w:numId w:val="17"/>
         </w:numPr>
-      </w:pPr>
-      <w:r>
-        <w:rPr>
+        <w:rPr>
+          <w:rFonts w:asciiTheme="majorBidi" w:hAnsiTheme="majorBidi" w:cstheme="majorBidi"/>
+        </w:rPr>
+      </w:pPr>
+      <w:r>
+        <w:rPr>
+          <w:rFonts w:asciiTheme="majorBidi" w:hAnsiTheme="majorBidi" w:cstheme="majorBidi"/>
           <w:b/>
           <w:bCs/>
         </w:rPr>
         <w:t>Measurable Outcomes:</w:t>
       </w:r>
       <w:r>
+        <w:rPr>
+          <w:rFonts w:asciiTheme="majorBidi" w:hAnsiTheme="majorBidi" w:cstheme="majorBidi"/>
+        </w:rPr>
         <w:t xml:space="preserve"> The software automatically gets better—there are fewer bugs, less time wasted fixing mistakes (rework), and faster overall delivery.</w:t>
       </w:r>
     </w:p>
@@ -3053,15 +3181,22 @@
           <w:ilvl w:val="0"/>
           <w:numId w:val="17"/>
         </w:numPr>
-      </w:pPr>
-      <w:r>
-        <w:rPr>
+        <w:rPr>
+          <w:rFonts w:asciiTheme="majorBidi" w:hAnsiTheme="majorBidi" w:cstheme="majorBidi"/>
+        </w:rPr>
+      </w:pPr>
+      <w:r>
+        <w:rPr>
+          <w:rFonts w:asciiTheme="majorBidi" w:hAnsiTheme="majorBidi" w:cstheme="majorBidi"/>
           <w:b/>
           <w:bCs/>
         </w:rPr>
         <w:t>Financial Returns:</w:t>
       </w:r>
       <w:r>
+        <w:rPr>
+          <w:rFonts w:asciiTheme="majorBidi" w:hAnsiTheme="majorBidi" w:cstheme="majorBidi"/>
+        </w:rPr>
         <w:t xml:space="preserve"> The company saves massive amounts of money because they aren't dealing with broken software, and they make more money by releasing products faster than competitors.</w:t>
       </w:r>
     </w:p>
@@ -3072,21 +3207,29 @@
           <w:ilvl w:val="0"/>
           <w:numId w:val="17"/>
         </w:numPr>
-      </w:pPr>
-      <w:r>
-        <w:rPr>
+        <w:rPr>
+          <w:rFonts w:asciiTheme="majorBidi" w:hAnsiTheme="majorBidi" w:cstheme="majorBidi"/>
+        </w:rPr>
+      </w:pPr>
+      <w:r>
+        <w:rPr>
+          <w:rFonts w:asciiTheme="majorBidi" w:hAnsiTheme="majorBidi" w:cstheme="majorBidi"/>
           <w:b/>
           <w:bCs/>
         </w:rPr>
         <w:t>Reinvestment:</w:t>
       </w:r>
       <w:r>
+        <w:rPr>
+          <w:rFonts w:asciiTheme="majorBidi" w:hAnsiTheme="majorBidi" w:cstheme="majorBidi"/>
+        </w:rPr>
         <w:t xml:space="preserve"> The company takes those extra profits and pumps them back into the loop to improve even further.</w:t>
       </w:r>
     </w:p>
     <w:p>
       <w:pPr>
         <w:rPr>
+          <w:rFonts w:asciiTheme="majorBidi" w:hAnsiTheme="majorBidi" w:cstheme="majorBidi"/>
           <w:sz w:val="24"/>
           <w:szCs w:val="24"/>
         </w:rPr>

</xml_diff>